<commit_message>
Report: embed PNG diagrams + restructure repo/sample sections as tables
- New scripts/generate-diagrams.py renders 3 PNG diagrams using Pillow:
  * diagram-architecture.png: 5-component system flow
  * diagram-workflow.png: all 19 n8n nodes laid out in 3 rows
  * diagram-sample-run.png: 8.2-second timeline of a sample PR
- generate-report.js now embeds each PNG via ImageRun in the relevant
  section, replacing the previous ASCII art code blocks.
- Section 1 Executive Summary: prose paragraphs -> 7-row fact table.
- Section 6 Architecture: ASCII box-drawing -> architecture PNG.
- Section 7.1 Workflow: 20-item numbered list -> workflow PNG + 5-row
  node-type legend table.
- Section 8 Repository Structure: long ASCII tree -> 3 clean tables
  (top-level folders, frontend/ detail, scripts/ detail).
- Section 12 Sample Run: 5 sub-sections of prose -> timeline PNG +
  compact findings table + summary card.

Report grows 27 KB -> 164 KB due to PNG payload. 15 tables, 451 paragraphs.
</commit_message>
<xml_diff>
--- a/ProITBridge_ReviewAI_Project_Report.docx
+++ b/ProITBridge_ReviewAI_Project_Report.docx
@@ -181,38 +181,522 @@
         <w:t xml:space="preserve">1. Executive Summary</w:t>
       </w:r>
     </w:p>
-    <w:p>
-      <w:pPr>
-        <w:spacing w:after="80" w:before="80"/>
-      </w:pPr>
-      <w:r>
-        <w:t xml:space="preserve">ProITBridge ReviewAI is a self-hosted, open-source AI-powered code review bot for GitHub pull requests. The bot watches a configured GitHub organization, automatically reviews every pull request opened against any of its watched repositories, and posts inline review comments with severity ratings, categorical classifications, and one-click code suggestions — all within ten seconds of PR creation.</w:t>
-      </w:r>
-    </w:p>
-    <w:p>
-      <w:pPr>
-        <w:spacing w:after="80" w:before="80"/>
-      </w:pPr>
-      <w:r>
-        <w:t xml:space="preserve">The system replaces the manual first-pass code review burden that senior engineers typically carry, freeing them to focus on architecture-level reviews while the bot handles consistency checks, security gates, and pattern enforcement. Every PR receives the same standard of scrutiny, every time.</w:t>
-      </w:r>
-    </w:p>
-    <w:p>
-      <w:pPr>
-        <w:spacing w:after="80" w:before="80"/>
-      </w:pPr>
-      <w:r>
-        <w:t xml:space="preserve">Built end-to-end on a one hundred percent free-tier infrastructure stack (Railway, Vercel, GitHub Actions, Anthropic API free credits), ReviewAI is the open-source alternative to commercial offerings like CodeRabbit (priced at $24 per developer per month) and integrated IDE review tools. The total operational cost is approximately one cent per pull request reviewed, derived solely from Claude API inference costs.</w:t>
-      </w:r>
-    </w:p>
-    <w:p>
-      <w:pPr>
-        <w:spacing w:after="80" w:before="80"/>
-      </w:pPr>
-      <w:r>
-        <w:t xml:space="preserve">This report provides a comprehensive end-to-end documentation of the project covering the problem statement, target users, system architecture, component breakdown, complete workflow, file-level repository structure, deployment guide, end-to-end sample execution, and future roadmap.</w:t>
-      </w:r>
-    </w:p>
+    <w:tbl>
+      <w:tblPr>
+        <w:tblW w:type="dxa" w:w="9360"/>
+        <w:tblBorders>
+          <w:top w:val="single" w:color="auto" w:sz="4"/>
+          <w:left w:val="single" w:color="auto" w:sz="4"/>
+          <w:bottom w:val="single" w:color="auto" w:sz="4"/>
+          <w:right w:val="single" w:color="auto" w:sz="4"/>
+          <w:insideH w:val="single" w:color="auto" w:sz="4"/>
+          <w:insideV w:val="single" w:color="auto" w:sz="4"/>
+        </w:tblBorders>
+      </w:tblPr>
+      <w:tblGrid>
+        <w:gridCol w:w="1800"/>
+        <w:gridCol w:w="7560"/>
+      </w:tblGrid>
+      <w:tr>
+        <w:trPr>
+          <w:tblHeader/>
+        </w:trPr>
+        <w:tc>
+          <w:tcPr>
+            <w:tcW w:type="dxa" w:w="0"/>
+            <w:tcBorders>
+              <w:top w:val="single" w:color="CCCCCC" w:sz="4"/>
+              <w:left w:val="single" w:color="CCCCCC" w:sz="4"/>
+              <w:bottom w:val="single" w:color="CCCCCC" w:sz="4"/>
+              <w:right w:val="single" w:color="CCCCCC" w:sz="4"/>
+            </w:tcBorders>
+            <w:shd w:fill="0B1D3F" w:val="clear"/>
+            <w:tcMar>
+              <w:top w:type="dxa" w:w="100"/>
+              <w:left w:type="dxa" w:w="140"/>
+              <w:bottom w:type="dxa" w:w="100"/>
+              <w:right w:type="dxa" w:w="140"/>
+            </w:tcMar>
+          </w:tcPr>
+          <w:p>
+            <w:r>
+              <w:rPr>
+                <w:b/>
+                <w:bCs/>
+                <w:color w:val="FFFFFF"/>
+                <w:sz w:val="20"/>
+                <w:szCs w:val="20"/>
+              </w:rPr>
+              <w:t xml:space="preserve">Field</w:t>
+            </w:r>
+          </w:p>
+        </w:tc>
+        <w:tc>
+          <w:tcPr>
+            <w:tcW w:type="dxa" w:w="0"/>
+            <w:tcBorders>
+              <w:top w:val="single" w:color="CCCCCC" w:sz="4"/>
+              <w:left w:val="single" w:color="CCCCCC" w:sz="4"/>
+              <w:bottom w:val="single" w:color="CCCCCC" w:sz="4"/>
+              <w:right w:val="single" w:color="CCCCCC" w:sz="4"/>
+            </w:tcBorders>
+            <w:shd w:fill="0B1D3F" w:val="clear"/>
+            <w:tcMar>
+              <w:top w:type="dxa" w:w="100"/>
+              <w:left w:type="dxa" w:w="140"/>
+              <w:bottom w:type="dxa" w:w="100"/>
+              <w:right w:type="dxa" w:w="140"/>
+            </w:tcMar>
+          </w:tcPr>
+          <w:p>
+            <w:r>
+              <w:rPr>
+                <w:b/>
+                <w:bCs/>
+                <w:color w:val="FFFFFF"/>
+                <w:sz w:val="20"/>
+                <w:szCs w:val="20"/>
+              </w:rPr>
+              <w:t xml:space="preserve">Detail</w:t>
+            </w:r>
+          </w:p>
+        </w:tc>
+      </w:tr>
+      <w:tr>
+        <w:tc>
+          <w:tcPr>
+            <w:tcW w:type="dxa" w:w="0"/>
+            <w:tcBorders>
+              <w:top w:val="single" w:color="CCCCCC" w:sz="4"/>
+              <w:left w:val="single" w:color="CCCCCC" w:sz="4"/>
+              <w:bottom w:val="single" w:color="CCCCCC" w:sz="4"/>
+              <w:right w:val="single" w:color="CCCCCC" w:sz="4"/>
+            </w:tcBorders>
+            <w:tcMar>
+              <w:top w:type="dxa" w:w="80"/>
+              <w:left w:type="dxa" w:w="140"/>
+              <w:bottom w:type="dxa" w:w="80"/>
+              <w:right w:type="dxa" w:w="140"/>
+            </w:tcMar>
+          </w:tcPr>
+          <w:p>
+            <w:r>
+              <w:rPr>
+                <w:rFonts w:ascii="Arial" w:cs="Arial" w:eastAsia="Arial" w:hAnsi="Arial"/>
+                <w:b/>
+                <w:bCs/>
+                <w:color w:val="0F172A"/>
+                <w:sz w:val="20"/>
+                <w:szCs w:val="20"/>
+              </w:rPr>
+              <w:t xml:space="preserve">What it is</w:t>
+            </w:r>
+          </w:p>
+        </w:tc>
+        <w:tc>
+          <w:tcPr>
+            <w:tcW w:type="dxa" w:w="0"/>
+            <w:tcBorders>
+              <w:top w:val="single" w:color="CCCCCC" w:sz="4"/>
+              <w:left w:val="single" w:color="CCCCCC" w:sz="4"/>
+              <w:bottom w:val="single" w:color="CCCCCC" w:sz="4"/>
+              <w:right w:val="single" w:color="CCCCCC" w:sz="4"/>
+            </w:tcBorders>
+            <w:tcMar>
+              <w:top w:type="dxa" w:w="80"/>
+              <w:left w:type="dxa" w:w="140"/>
+              <w:bottom w:type="dxa" w:w="80"/>
+              <w:right w:type="dxa" w:w="140"/>
+            </w:tcMar>
+          </w:tcPr>
+          <w:p>
+            <w:r>
+              <w:rPr>
+                <w:rFonts w:ascii="Arial" w:cs="Arial" w:eastAsia="Arial" w:hAnsi="Arial"/>
+                <w:b w:val="false"/>
+                <w:bCs w:val="false"/>
+                <w:color w:val="0F172A"/>
+                <w:sz w:val="20"/>
+                <w:szCs w:val="20"/>
+              </w:rPr>
+              <w:t xml:space="preserve">Open-source AI code review bot for GitHub pull requests — self-hosted, free-tier stack</w:t>
+            </w:r>
+          </w:p>
+        </w:tc>
+      </w:tr>
+      <w:tr>
+        <w:tc>
+          <w:tcPr>
+            <w:tcW w:type="dxa" w:w="0"/>
+            <w:tcBorders>
+              <w:top w:val="single" w:color="CCCCCC" w:sz="4"/>
+              <w:left w:val="single" w:color="CCCCCC" w:sz="4"/>
+              <w:bottom w:val="single" w:color="CCCCCC" w:sz="4"/>
+              <w:right w:val="single" w:color="CCCCCC" w:sz="4"/>
+            </w:tcBorders>
+            <w:tcMar>
+              <w:top w:type="dxa" w:w="80"/>
+              <w:left w:type="dxa" w:w="140"/>
+              <w:bottom w:type="dxa" w:w="80"/>
+              <w:right w:type="dxa" w:w="140"/>
+            </w:tcMar>
+          </w:tcPr>
+          <w:p>
+            <w:r>
+              <w:rPr>
+                <w:rFonts w:ascii="Arial" w:cs="Arial" w:eastAsia="Arial" w:hAnsi="Arial"/>
+                <w:b/>
+                <w:bCs/>
+                <w:color w:val="0F172A"/>
+                <w:sz w:val="20"/>
+                <w:szCs w:val="20"/>
+              </w:rPr>
+              <w:t xml:space="preserve">What it does</w:t>
+            </w:r>
+          </w:p>
+        </w:tc>
+        <w:tc>
+          <w:tcPr>
+            <w:tcW w:type="dxa" w:w="0"/>
+            <w:tcBorders>
+              <w:top w:val="single" w:color="CCCCCC" w:sz="4"/>
+              <w:left w:val="single" w:color="CCCCCC" w:sz="4"/>
+              <w:bottom w:val="single" w:color="CCCCCC" w:sz="4"/>
+              <w:right w:val="single" w:color="CCCCCC" w:sz="4"/>
+            </w:tcBorders>
+            <w:tcMar>
+              <w:top w:type="dxa" w:w="80"/>
+              <w:left w:type="dxa" w:w="140"/>
+              <w:bottom w:type="dxa" w:w="80"/>
+              <w:right w:type="dxa" w:w="140"/>
+            </w:tcMar>
+          </w:tcPr>
+          <w:p>
+            <w:r>
+              <w:rPr>
+                <w:rFonts w:ascii="Arial" w:cs="Arial" w:eastAsia="Arial" w:hAnsi="Arial"/>
+                <w:b w:val="false"/>
+                <w:bCs w:val="false"/>
+                <w:color w:val="0F172A"/>
+                <w:sz w:val="20"/>
+                <w:szCs w:val="20"/>
+              </w:rPr>
+              <w:t xml:space="preserve">Reviews every PR within 10 seconds — posts inline comments with severity, category, suggestion, rationale</w:t>
+            </w:r>
+          </w:p>
+        </w:tc>
+      </w:tr>
+      <w:tr>
+        <w:tc>
+          <w:tcPr>
+            <w:tcW w:type="dxa" w:w="0"/>
+            <w:tcBorders>
+              <w:top w:val="single" w:color="CCCCCC" w:sz="4"/>
+              <w:left w:val="single" w:color="CCCCCC" w:sz="4"/>
+              <w:bottom w:val="single" w:color="CCCCCC" w:sz="4"/>
+              <w:right w:val="single" w:color="CCCCCC" w:sz="4"/>
+            </w:tcBorders>
+            <w:tcMar>
+              <w:top w:type="dxa" w:w="80"/>
+              <w:left w:type="dxa" w:w="140"/>
+              <w:bottom w:type="dxa" w:w="80"/>
+              <w:right w:type="dxa" w:w="140"/>
+            </w:tcMar>
+          </w:tcPr>
+          <w:p>
+            <w:r>
+              <w:rPr>
+                <w:rFonts w:ascii="Arial" w:cs="Arial" w:eastAsia="Arial" w:hAnsi="Arial"/>
+                <w:b/>
+                <w:bCs/>
+                <w:color w:val="0F172A"/>
+                <w:sz w:val="20"/>
+                <w:szCs w:val="20"/>
+              </w:rPr>
+              <w:t xml:space="preserve">Built with</w:t>
+            </w:r>
+          </w:p>
+        </w:tc>
+        <w:tc>
+          <w:tcPr>
+            <w:tcW w:type="dxa" w:w="0"/>
+            <w:tcBorders>
+              <w:top w:val="single" w:color="CCCCCC" w:sz="4"/>
+              <w:left w:val="single" w:color="CCCCCC" w:sz="4"/>
+              <w:bottom w:val="single" w:color="CCCCCC" w:sz="4"/>
+              <w:right w:val="single" w:color="CCCCCC" w:sz="4"/>
+            </w:tcBorders>
+            <w:tcMar>
+              <w:top w:type="dxa" w:w="80"/>
+              <w:left w:type="dxa" w:w="140"/>
+              <w:bottom w:type="dxa" w:w="80"/>
+              <w:right w:type="dxa" w:w="140"/>
+            </w:tcMar>
+          </w:tcPr>
+          <w:p>
+            <w:r>
+              <w:rPr>
+                <w:rFonts w:ascii="Arial" w:cs="Arial" w:eastAsia="Arial" w:hAnsi="Arial"/>
+                <w:b w:val="false"/>
+                <w:bCs w:val="false"/>
+                <w:color w:val="0F172A"/>
+                <w:sz w:val="20"/>
+                <w:szCs w:val="20"/>
+              </w:rPr>
+              <w:t xml:space="preserve">n8n · Anthropic Claude 4.5 · Next.js 14 · PostgreSQL · Railway · Vercel</w:t>
+            </w:r>
+          </w:p>
+        </w:tc>
+      </w:tr>
+      <w:tr>
+        <w:tc>
+          <w:tcPr>
+            <w:tcW w:type="dxa" w:w="0"/>
+            <w:tcBorders>
+              <w:top w:val="single" w:color="CCCCCC" w:sz="4"/>
+              <w:left w:val="single" w:color="CCCCCC" w:sz="4"/>
+              <w:bottom w:val="single" w:color="CCCCCC" w:sz="4"/>
+              <w:right w:val="single" w:color="CCCCCC" w:sz="4"/>
+            </w:tcBorders>
+            <w:tcMar>
+              <w:top w:type="dxa" w:w="80"/>
+              <w:left w:type="dxa" w:w="140"/>
+              <w:bottom w:type="dxa" w:w="80"/>
+              <w:right w:type="dxa" w:w="140"/>
+            </w:tcMar>
+          </w:tcPr>
+          <w:p>
+            <w:r>
+              <w:rPr>
+                <w:rFonts w:ascii="Arial" w:cs="Arial" w:eastAsia="Arial" w:hAnsi="Arial"/>
+                <w:b/>
+                <w:bCs/>
+                <w:color w:val="0F172A"/>
+                <w:sz w:val="20"/>
+                <w:szCs w:val="20"/>
+              </w:rPr>
+              <w:t xml:space="preserve">Replaces</w:t>
+            </w:r>
+          </w:p>
+        </w:tc>
+        <w:tc>
+          <w:tcPr>
+            <w:tcW w:type="dxa" w:w="0"/>
+            <w:tcBorders>
+              <w:top w:val="single" w:color="CCCCCC" w:sz="4"/>
+              <w:left w:val="single" w:color="CCCCCC" w:sz="4"/>
+              <w:bottom w:val="single" w:color="CCCCCC" w:sz="4"/>
+              <w:right w:val="single" w:color="CCCCCC" w:sz="4"/>
+            </w:tcBorders>
+            <w:tcMar>
+              <w:top w:type="dxa" w:w="80"/>
+              <w:left w:type="dxa" w:w="140"/>
+              <w:bottom w:type="dxa" w:w="80"/>
+              <w:right w:type="dxa" w:w="140"/>
+            </w:tcMar>
+          </w:tcPr>
+          <w:p>
+            <w:r>
+              <w:rPr>
+                <w:rFonts w:ascii="Arial" w:cs="Arial" w:eastAsia="Arial" w:hAnsi="Arial"/>
+                <w:b w:val="false"/>
+                <w:bCs w:val="false"/>
+                <w:color w:val="0F172A"/>
+                <w:sz w:val="20"/>
+                <w:szCs w:val="20"/>
+              </w:rPr>
+              <w:t xml:space="preserve">CodeRabbit ($24/dev/mo) · Cursor review · manual first-pass review by senior engineers</w:t>
+            </w:r>
+          </w:p>
+        </w:tc>
+      </w:tr>
+      <w:tr>
+        <w:tc>
+          <w:tcPr>
+            <w:tcW w:type="dxa" w:w="0"/>
+            <w:tcBorders>
+              <w:top w:val="single" w:color="CCCCCC" w:sz="4"/>
+              <w:left w:val="single" w:color="CCCCCC" w:sz="4"/>
+              <w:bottom w:val="single" w:color="CCCCCC" w:sz="4"/>
+              <w:right w:val="single" w:color="CCCCCC" w:sz="4"/>
+            </w:tcBorders>
+            <w:tcMar>
+              <w:top w:type="dxa" w:w="80"/>
+              <w:left w:type="dxa" w:w="140"/>
+              <w:bottom w:type="dxa" w:w="80"/>
+              <w:right w:type="dxa" w:w="140"/>
+            </w:tcMar>
+          </w:tcPr>
+          <w:p>
+            <w:r>
+              <w:rPr>
+                <w:rFonts w:ascii="Arial" w:cs="Arial" w:eastAsia="Arial" w:hAnsi="Arial"/>
+                <w:b/>
+                <w:bCs/>
+                <w:color w:val="0F172A"/>
+                <w:sz w:val="20"/>
+                <w:szCs w:val="20"/>
+              </w:rPr>
+              <w:t xml:space="preserve">Cost</w:t>
+            </w:r>
+          </w:p>
+        </w:tc>
+        <w:tc>
+          <w:tcPr>
+            <w:tcW w:type="dxa" w:w="0"/>
+            <w:tcBorders>
+              <w:top w:val="single" w:color="CCCCCC" w:sz="4"/>
+              <w:left w:val="single" w:color="CCCCCC" w:sz="4"/>
+              <w:bottom w:val="single" w:color="CCCCCC" w:sz="4"/>
+              <w:right w:val="single" w:color="CCCCCC" w:sz="4"/>
+            </w:tcBorders>
+            <w:tcMar>
+              <w:top w:type="dxa" w:w="80"/>
+              <w:left w:type="dxa" w:w="140"/>
+              <w:bottom w:type="dxa" w:w="80"/>
+              <w:right w:type="dxa" w:w="140"/>
+            </w:tcMar>
+          </w:tcPr>
+          <w:p>
+            <w:r>
+              <w:rPr>
+                <w:rFonts w:ascii="Arial" w:cs="Arial" w:eastAsia="Arial" w:hAnsi="Arial"/>
+                <w:b w:val="false"/>
+                <w:bCs w:val="false"/>
+                <w:color w:val="0F172A"/>
+                <w:sz w:val="20"/>
+                <w:szCs w:val="20"/>
+              </w:rPr>
+              <w:t xml:space="preserve">$0/month infrastructure (free tiers) + ~$0.01 per PR (Claude inference)</w:t>
+            </w:r>
+          </w:p>
+        </w:tc>
+      </w:tr>
+      <w:tr>
+        <w:tc>
+          <w:tcPr>
+            <w:tcW w:type="dxa" w:w="0"/>
+            <w:tcBorders>
+              <w:top w:val="single" w:color="CCCCCC" w:sz="4"/>
+              <w:left w:val="single" w:color="CCCCCC" w:sz="4"/>
+              <w:bottom w:val="single" w:color="CCCCCC" w:sz="4"/>
+              <w:right w:val="single" w:color="CCCCCC" w:sz="4"/>
+            </w:tcBorders>
+            <w:tcMar>
+              <w:top w:type="dxa" w:w="80"/>
+              <w:left w:type="dxa" w:w="140"/>
+              <w:bottom w:type="dxa" w:w="80"/>
+              <w:right w:type="dxa" w:w="140"/>
+            </w:tcMar>
+          </w:tcPr>
+          <w:p>
+            <w:r>
+              <w:rPr>
+                <w:rFonts w:ascii="Arial" w:cs="Arial" w:eastAsia="Arial" w:hAnsi="Arial"/>
+                <w:b/>
+                <w:bCs/>
+                <w:color w:val="0F172A"/>
+                <w:sz w:val="20"/>
+                <w:szCs w:val="20"/>
+              </w:rPr>
+              <w:t xml:space="preserve">License</w:t>
+            </w:r>
+          </w:p>
+        </w:tc>
+        <w:tc>
+          <w:tcPr>
+            <w:tcW w:type="dxa" w:w="0"/>
+            <w:tcBorders>
+              <w:top w:val="single" w:color="CCCCCC" w:sz="4"/>
+              <w:left w:val="single" w:color="CCCCCC" w:sz="4"/>
+              <w:bottom w:val="single" w:color="CCCCCC" w:sz="4"/>
+              <w:right w:val="single" w:color="CCCCCC" w:sz="4"/>
+            </w:tcBorders>
+            <w:tcMar>
+              <w:top w:type="dxa" w:w="80"/>
+              <w:left w:type="dxa" w:w="140"/>
+              <w:bottom w:type="dxa" w:w="80"/>
+              <w:right w:type="dxa" w:w="140"/>
+            </w:tcMar>
+          </w:tcPr>
+          <w:p>
+            <w:r>
+              <w:rPr>
+                <w:rFonts w:ascii="Arial" w:cs="Arial" w:eastAsia="Arial" w:hAnsi="Arial"/>
+                <w:b w:val="false"/>
+                <w:bCs w:val="false"/>
+                <w:color w:val="0F172A"/>
+                <w:sz w:val="20"/>
+                <w:szCs w:val="20"/>
+              </w:rPr>
+              <w:t xml:space="preserve">MIT — fork, host, modify, sell</w:t>
+            </w:r>
+          </w:p>
+        </w:tc>
+      </w:tr>
+      <w:tr>
+        <w:tc>
+          <w:tcPr>
+            <w:tcW w:type="dxa" w:w="0"/>
+            <w:tcBorders>
+              <w:top w:val="single" w:color="CCCCCC" w:sz="4"/>
+              <w:left w:val="single" w:color="CCCCCC" w:sz="4"/>
+              <w:bottom w:val="single" w:color="CCCCCC" w:sz="4"/>
+              <w:right w:val="single" w:color="CCCCCC" w:sz="4"/>
+            </w:tcBorders>
+            <w:tcMar>
+              <w:top w:type="dxa" w:w="80"/>
+              <w:left w:type="dxa" w:w="140"/>
+              <w:bottom w:type="dxa" w:w="80"/>
+              <w:right w:type="dxa" w:w="140"/>
+            </w:tcMar>
+          </w:tcPr>
+          <w:p>
+            <w:r>
+              <w:rPr>
+                <w:rFonts w:ascii="Arial" w:cs="Arial" w:eastAsia="Arial" w:hAnsi="Arial"/>
+                <w:b/>
+                <w:bCs/>
+                <w:color w:val="0F172A"/>
+                <w:sz w:val="20"/>
+                <w:szCs w:val="20"/>
+              </w:rPr>
+              <w:t xml:space="preserve">Live demo</w:t>
+            </w:r>
+          </w:p>
+        </w:tc>
+        <w:tc>
+          <w:tcPr>
+            <w:tcW w:type="dxa" w:w="0"/>
+            <w:tcBorders>
+              <w:top w:val="single" w:color="CCCCCC" w:sz="4"/>
+              <w:left w:val="single" w:color="CCCCCC" w:sz="4"/>
+              <w:bottom w:val="single" w:color="CCCCCC" w:sz="4"/>
+              <w:right w:val="single" w:color="CCCCCC" w:sz="4"/>
+            </w:tcBorders>
+            <w:tcMar>
+              <w:top w:type="dxa" w:w="80"/>
+              <w:left w:type="dxa" w:w="140"/>
+              <w:bottom w:type="dxa" w:w="80"/>
+              <w:right w:type="dxa" w:w="140"/>
+            </w:tcMar>
+          </w:tcPr>
+          <w:p>
+            <w:r>
+              <w:rPr>
+                <w:rFonts w:ascii="Consolas" w:cs="Consolas" w:eastAsia="Consolas" w:hAnsi="Consolas"/>
+                <w:b w:val="false"/>
+                <w:bCs w:val="false"/>
+                <w:color w:val="0F172A"/>
+                <w:sz w:val="18"/>
+                <w:szCs w:val="18"/>
+              </w:rPr>
+              <w:t xml:space="preserve">proitbridge-reviewai.vercel.app</w:t>
+            </w:r>
+          </w:p>
+        </w:tc>
+      </w:tr>
+    </w:tbl>
     <w:p>
       <w:pPr>
         <w:pStyle w:val="Heading1"/>
@@ -2668,7 +3152,7 @@
         <w:pStyle w:val="Heading2"/>
       </w:pPr>
       <w:r>
-        <w:t xml:space="preserve">6.1 High-Level Architecture Diagram</w:t>
+        <w:t xml:space="preserve">6.1 High-Level Architecture</w:t>
       </w:r>
     </w:p>
     <w:p>
@@ -2676,75 +3160,69 @@
         <w:spacing w:after="80" w:before="80"/>
       </w:pPr>
       <w:r>
-        <w:t xml:space="preserve">The following diagram shows the full system flow from a GitHub pull request event through to inline comments, persistent storage, and dashboard visualization.</w:t>
-      </w:r>
-    </w:p>
-    <w:p>
-      <w:pPr>
-        <w:shd w:fill="F8FAFC" w:val="clear"/>
-        <w:spacing w:after="60" w:before="60"/>
+        <w:t xml:space="preserve">The full system in one picture — five components, clear data flow.</w:t>
+      </w:r>
+    </w:p>
+    <w:p>
+      <w:pPr>
+        <w:spacing w:after="80" w:before="120"/>
+        <w:jc w:val="center"/>
+      </w:pPr>
+      <w:r>
+        <w:drawing>
+          <wp:inline distT="0" distB="0" distL="0" distR="0">
+            <wp:extent cx="5905500" cy="3810000"/>
+            <wp:effectExtent t="0" r="0" b="0" l="0"/>
+            <wp:docPr id="1" name="diagram-architecture.png" descr="Figure 1 — GitHub fires a webhook, n8n orchestrates, Claude reviews, Postgres persists, Vercel renders." title="Figure 1 — GitHub fires a webhook, n8n orchestrates, Claude reviews, Postgres persists, Vercel renders."/>
+            <wp:cNvGraphicFramePr>
+              <a:graphicFrameLocks xmlns:a="http://schemas.openxmlformats.org/drawingml/2006/main" noChangeAspect="1"/>
+            </wp:cNvGraphicFramePr>
+            <a:graphic xmlns:a="http://schemas.openxmlformats.org/drawingml/2006/main">
+              <a:graphicData uri="http://schemas.openxmlformats.org/drawingml/2006/picture">
+                <pic:pic xmlns:pic="http://schemas.openxmlformats.org/drawingml/2006/picture">
+                  <pic:nvPicPr>
+                    <pic:cNvPr id="0" name="" descr=""/>
+                    <pic:cNvPicPr>
+                      <a:picLocks noChangeAspect="1" noChangeArrowheads="1"/>
+                    </pic:cNvPicPr>
+                  </pic:nvPicPr>
+                  <pic:blipFill>
+                    <a:blip r:embed="rId9" cstate="none"/>
+                    <a:srcRect/>
+                    <a:stretch>
+                      <a:fillRect/>
+                    </a:stretch>
+                  </pic:blipFill>
+                  <pic:spPr bwMode="auto">
+                    <a:xfrm>
+                      <a:off x="0" y="0"/>
+                      <a:ext cx="5905500" cy="3810000"/>
+                    </a:xfrm>
+                    <a:prstGeom prst="rect">
+                      <a:avLst/>
+                    </a:prstGeom>
+                  </pic:spPr>
+                </pic:pic>
+              </a:graphicData>
+            </a:graphic>
+          </wp:inline>
+        </w:drawing>
+      </w:r>
+    </w:p>
+    <w:p>
+      <w:pPr>
+        <w:spacing w:after="160" w:before="0"/>
+        <w:jc w:val="center"/>
       </w:pPr>
       <w:r>
         <w:rPr>
-          <w:rFonts w:ascii="Consolas" w:cs="Consolas" w:eastAsia="Consolas" w:hAnsi="Consolas"/>
-          <w:color w:val="0F172A"/>
+          <w:i/>
+          <w:iCs/>
+          <w:color w:val="64748B"/>
           <w:sz w:val="18"/>
           <w:szCs w:val="18"/>
         </w:rPr>
-        <w:t xml:space="preserve">                      GitHub Pull Request opens
-                                 │
-                                 ▼
-                  ┌──────────────────────────────────┐
-                  │  n8n on Railway (Docker)         │
-                  │  Webhook: /webhook/pr-review     │
-                  │                                  │
-                  │  Workflow steps:                 │
-                  │  1. Respond 200 (fast ack)       │
-                  │  2. Verify HMAC signature        │
-                  │  3. Filter to opened action      │
-                  │  4. Extract PR fields            │
-                  │  5. Upsert prs row in Postgres   │
-                  │  6. GET PR files via Octokit     │
-                  │  7. Filter generated files       │
-                  │  8. Loop per source file:        │
-                  │     - GET full file content      │
-                  │     - Decode base64 + build body │
-                  │     - POST to Anthropic Claude   │
-                  │     - Parse JSON findings        │
-                  │     - Filter by severity         │
-                  │     - Split into individual rows │
-                  │     - POST inline comment        │
-                  │     - INSERT finding to Postgres │
-                  │  9. After loop:                  │
-                  │     - Count findings             │
-                  │     - POST summary comment       │
-                  └────────┬──────────────┬──────────┘
-                           │              │
-                           ▼              ▼
-              ┌────────────────┐   ┌──────────────────┐
-              │ Anthropic API  │   │ Postgres (Railway)│
-              │ Claude 4.5     │   │ - prs            │
-              │ Haiku / Sonnet │   │ - findings       │
-              └────────────────┘   │ - resolutions    │
-                                   │ - repo_config    │
-                                   └──────────┬───────┘
-                                              │
-                                              ▼
-                            ┌────────────────────────────────┐
-                            │ Next.js dashboard (Vercel)     │
-                            │                                │
-                            │ Public:                        │
-                            │  / (landing page)              │
-                            │  /how-it-works                 │
-                            │  /pricing                      │
-                            │  /docs                         │
-                            │                                │
-                            │ Authenticated:                 │
-                            │  /dashboard (live PR queue)    │
-                            │  /findings (table)             │
-                            │  /analytics (charts)           │
-                            │  /settings (per-repo config)   │
-                            └────────────────────────────────┘</w:t>
+        <w:t xml:space="preserve">Figure 1 — GitHub fires a webhook, n8n orchestrates, Claude reviews, Postgres persists, Vercel renders.</w:t>
       </w:r>
     </w:p>
     <w:p>
@@ -3235,247 +3713,655 @@
         <w:spacing w:after="80" w:before="80"/>
       </w:pPr>
       <w:r>
-        <w:t xml:space="preserve">The primary mode of operation. A developer opens a pull request on a watched repository, and within ten seconds the bot has posted inline review comments and a summary comment.</w:t>
-      </w:r>
-    </w:p>
-    <w:p>
-      <w:pPr>
-        <w:pStyle w:val="ListParagraph"/>
-        <w:numPr>
-          <w:ilvl w:val="0"/>
-          <w:numId w:val="3"/>
-        </w:numPr>
-      </w:pPr>
-      <w:r>
-        <w:t xml:space="preserve">Developer opens a PR on Madhavan1009/proitbridge-reviewai-demo.</w:t>
-      </w:r>
-    </w:p>
-    <w:p>
-      <w:pPr>
-        <w:pStyle w:val="ListParagraph"/>
-        <w:numPr>
-          <w:ilvl w:val="0"/>
-          <w:numId w:val="3"/>
-        </w:numPr>
-      </w:pPr>
-      <w:r>
-        <w:t xml:space="preserve">GitHub fires a pull_request webhook with action 'opened' to the n8n webhook URL, signed with X-Hub-Signature-256.</w:t>
-      </w:r>
-    </w:p>
-    <w:p>
-      <w:pPr>
-        <w:pStyle w:val="ListParagraph"/>
-        <w:numPr>
-          <w:ilvl w:val="0"/>
-          <w:numId w:val="3"/>
-        </w:numPr>
-      </w:pPr>
-      <w:r>
-        <w:t xml:space="preserve">n8n's Respond 200 node returns HTTP 200 immediately so GitHub does not retry.</w:t>
-      </w:r>
-    </w:p>
-    <w:p>
-      <w:pPr>
-        <w:pStyle w:val="ListParagraph"/>
-        <w:numPr>
-          <w:ilvl w:val="0"/>
-          <w:numId w:val="3"/>
-        </w:numPr>
-      </w:pPr>
-      <w:r>
-        <w:t xml:space="preserve">The Verify HMAC code node recomputes the signature using GITHUB_WEBHOOK_SECRET and rejects if it does not match.</w:t>
-      </w:r>
-    </w:p>
-    <w:p>
-      <w:pPr>
-        <w:pStyle w:val="ListParagraph"/>
-        <w:numPr>
-          <w:ilvl w:val="0"/>
-          <w:numId w:val="3"/>
-        </w:numPr>
-      </w:pPr>
-      <w:r>
-        <w:t xml:space="preserve">The IF node filters to only 'opened' and 'ready_for_review' actions; other actions short-circuit.</w:t>
-      </w:r>
-    </w:p>
-    <w:p>
-      <w:pPr>
-        <w:pStyle w:val="ListParagraph"/>
-        <w:numPr>
-          <w:ilvl w:val="0"/>
-          <w:numId w:val="3"/>
-        </w:numPr>
-      </w:pPr>
-      <w:r>
-        <w:t xml:space="preserve">Extract PR Fields lifts owner, repo, pr_number, title, author, head_sha, and github_pr_id into structured fields.</w:t>
-      </w:r>
-    </w:p>
-    <w:p>
-      <w:pPr>
-        <w:pStyle w:val="ListParagraph"/>
-        <w:numPr>
-          <w:ilvl w:val="0"/>
-          <w:numId w:val="3"/>
-        </w:numPr>
-      </w:pPr>
-      <w:r>
-        <w:t xml:space="preserve">Upsert PR Row writes (or updates) the prs row in Postgres and returns the auto-generated id.</w:t>
-      </w:r>
-    </w:p>
-    <w:p>
-      <w:pPr>
-        <w:pStyle w:val="ListParagraph"/>
-        <w:numPr>
-          <w:ilvl w:val="0"/>
-          <w:numId w:val="3"/>
-        </w:numPr>
-      </w:pPr>
-      <w:r>
-        <w:t xml:space="preserve">Get PR Files calls the GitHub Files API to list every file changed in the PR with its patch.</w:t>
-      </w:r>
-    </w:p>
-    <w:p>
-      <w:pPr>
-        <w:pStyle w:val="ListParagraph"/>
-        <w:numPr>
-          <w:ilvl w:val="0"/>
-          <w:numId w:val="3"/>
-        </w:numPr>
-      </w:pPr>
-      <w:r>
-        <w:t xml:space="preserve">Filter Files drops generated artifacts (package-lock.json, *.min.js, dist/, build/, vendor/) and files with more than 500 changed lines.</w:t>
-      </w:r>
-    </w:p>
-    <w:p>
-      <w:pPr>
-        <w:pStyle w:val="ListParagraph"/>
-        <w:numPr>
-          <w:ilvl w:val="0"/>
-          <w:numId w:val="3"/>
-        </w:numPr>
-      </w:pPr>
-      <w:r>
-        <w:t xml:space="preserve">Split Files iterates each remaining file. For each iteration, the workflow continues through the loop branch.</w:t>
-      </w:r>
-    </w:p>
-    <w:p>
-      <w:pPr>
-        <w:pStyle w:val="ListParagraph"/>
-        <w:numPr>
-          <w:ilvl w:val="0"/>
-          <w:numId w:val="3"/>
-        </w:numPr>
-      </w:pPr>
-      <w:r>
-        <w:t xml:space="preserve">Get File Content fetches the full file body via the GitHub Contents API.</w:t>
-      </w:r>
-    </w:p>
-    <w:p>
-      <w:pPr>
-        <w:pStyle w:val="ListParagraph"/>
-        <w:numPr>
-          <w:ilvl w:val="0"/>
-          <w:numId w:val="3"/>
-        </w:numPr>
-      </w:pPr>
-      <w:r>
-        <w:t xml:space="preserve">Decode Content unwraps base64 and assembles the full Claude request body (model, max_tokens, system prompt, user message).</w:t>
-      </w:r>
-    </w:p>
-    <w:p>
-      <w:pPr>
-        <w:pStyle w:val="ListParagraph"/>
-        <w:numPr>
-          <w:ilvl w:val="0"/>
-          <w:numId w:val="3"/>
-        </w:numPr>
-      </w:pPr>
-      <w:r>
-        <w:t xml:space="preserve">Call Claude posts the body to https://api.anthropic.com/v1/messages with the Header Auth credential.</w:t>
-      </w:r>
-    </w:p>
-    <w:p>
-      <w:pPr>
-        <w:pStyle w:val="ListParagraph"/>
-        <w:numPr>
-          <w:ilvl w:val="0"/>
-          <w:numId w:val="3"/>
-        </w:numPr>
-      </w:pPr>
-      <w:r>
-        <w:t xml:space="preserve">Parse Findings extracts the JSON array from Claude's text response and enriches each finding with file path, pr_db_id, owner, repo, pr_number, head_sha, and a pre-built commentBody.</w:t>
-      </w:r>
-    </w:p>
-    <w:p>
-      <w:pPr>
-        <w:pStyle w:val="ListParagraph"/>
-        <w:numPr>
-          <w:ilvl w:val="0"/>
-          <w:numId w:val="3"/>
-        </w:numPr>
-      </w:pPr>
-      <w:r>
-        <w:t xml:space="preserve">Filter By Severity drops nit/low findings (default threshold is medium) and caps at five findings per file.</w:t>
-      </w:r>
-    </w:p>
-    <w:p>
-      <w:pPr>
-        <w:pStyle w:val="ListParagraph"/>
-        <w:numPr>
-          <w:ilvl w:val="0"/>
-          <w:numId w:val="3"/>
-        </w:numPr>
-      </w:pPr>
-      <w:r>
-        <w:t xml:space="preserve">Split Findings emits one item per finding for downstream processing.</w:t>
-      </w:r>
-    </w:p>
-    <w:p>
-      <w:pPr>
-        <w:pStyle w:val="ListParagraph"/>
-        <w:numPr>
-          <w:ilvl w:val="0"/>
-          <w:numId w:val="3"/>
-        </w:numPr>
-      </w:pPr>
-      <w:r>
-        <w:t xml:space="preserve">Post Inline Comment posts a review comment to the GitHub PR using the pre-built commentBody, with severity emoji, suggestion block, and rationale.</w:t>
-      </w:r>
-    </w:p>
-    <w:p>
-      <w:pPr>
-        <w:pStyle w:val="ListParagraph"/>
-        <w:numPr>
-          <w:ilvl w:val="0"/>
-          <w:numId w:val="3"/>
-        </w:numPr>
-      </w:pPr>
-      <w:r>
-        <w:t xml:space="preserve">Insert Finding writes the finding to Postgres with a reference to the GitHub comment ID.</w:t>
-      </w:r>
-    </w:p>
-    <w:p>
-      <w:pPr>
-        <w:pStyle w:val="ListParagraph"/>
-        <w:numPr>
-          <w:ilvl w:val="0"/>
-          <w:numId w:val="3"/>
-        </w:numPr>
-      </w:pPr>
-      <w:r>
-        <w:t xml:space="preserve">After all files are processed, Count Findings queries the totals by severity for this PR.</w:t>
-      </w:r>
-    </w:p>
-    <w:p>
-      <w:pPr>
-        <w:pStyle w:val="ListParagraph"/>
-        <w:numPr>
-          <w:ilvl w:val="0"/>
-          <w:numId w:val="3"/>
-        </w:numPr>
-      </w:pPr>
-      <w:r>
-        <w:t xml:space="preserve">Post Summary Comment posts a final issue comment to the PR with a markdown table of severity counts and a link to the dashboard.</w:t>
+        <w:t xml:space="preserve">A developer opens a PR. Within ten seconds the bot has posted inline comments + a summary. The diagram below shows all 19 n8n nodes in order — colored by node type.</w:t>
+      </w:r>
+    </w:p>
+    <w:p>
+      <w:pPr>
+        <w:spacing w:after="80" w:before="120"/>
+        <w:jc w:val="center"/>
+      </w:pPr>
+      <w:r>
+        <w:drawing>
+          <wp:inline distT="0" distB="0" distL="0" distR="0">
+            <wp:extent cx="5905500" cy="3333750"/>
+            <wp:effectExtent t="0" r="0" b="0" l="0"/>
+            <wp:docPr id="1" name="diagram-workflow.png" descr="Figure 2 — pr-review workflow: top row is setup, middle row is the per-file loop body, bottom is the done branch." title="Figure 2 — pr-review workflow: top row is setup, middle row is the per-file loop body, bottom is the done branch."/>
+            <wp:cNvGraphicFramePr>
+              <a:graphicFrameLocks xmlns:a="http://schemas.openxmlformats.org/drawingml/2006/main" noChangeAspect="1"/>
+            </wp:cNvGraphicFramePr>
+            <a:graphic xmlns:a="http://schemas.openxmlformats.org/drawingml/2006/main">
+              <a:graphicData uri="http://schemas.openxmlformats.org/drawingml/2006/picture">
+                <pic:pic xmlns:pic="http://schemas.openxmlformats.org/drawingml/2006/picture">
+                  <pic:nvPicPr>
+                    <pic:cNvPr id="0" name="" descr=""/>
+                    <pic:cNvPicPr>
+                      <a:picLocks noChangeAspect="1" noChangeArrowheads="1"/>
+                    </pic:cNvPicPr>
+                  </pic:nvPicPr>
+                  <pic:blipFill>
+                    <a:blip r:embed="rId10" cstate="none"/>
+                    <a:srcRect/>
+                    <a:stretch>
+                      <a:fillRect/>
+                    </a:stretch>
+                  </pic:blipFill>
+                  <pic:spPr bwMode="auto">
+                    <a:xfrm>
+                      <a:off x="0" y="0"/>
+                      <a:ext cx="5905500" cy="3333750"/>
+                    </a:xfrm>
+                    <a:prstGeom prst="rect">
+                      <a:avLst/>
+                    </a:prstGeom>
+                  </pic:spPr>
+                </pic:pic>
+              </a:graphicData>
+            </a:graphic>
+          </wp:inline>
+        </w:drawing>
+      </w:r>
+    </w:p>
+    <w:p>
+      <w:pPr>
+        <w:spacing w:after="160" w:before="0"/>
+        <w:jc w:val="center"/>
+      </w:pPr>
+      <w:r>
+        <w:rPr>
+          <w:i/>
+          <w:iCs/>
+          <w:color w:val="64748B"/>
+          <w:sz w:val="18"/>
+          <w:szCs w:val="18"/>
+        </w:rPr>
+        <w:t xml:space="preserve">Figure 2 — pr-review workflow: top row is setup, middle row is the per-file loop body, bottom is the done branch.</w:t>
+      </w:r>
+    </w:p>
+    <w:p>
+      <w:pPr>
+        <w:pStyle w:val="Heading3"/>
+      </w:pPr>
+      <w:r>
+        <w:t xml:space="preserve">Node groups (color key)</w:t>
+      </w:r>
+    </w:p>
+    <w:tbl>
+      <w:tblPr>
+        <w:tblW w:type="dxa" w:w="9360"/>
+        <w:tblBorders>
+          <w:top w:val="single" w:color="auto" w:sz="4"/>
+          <w:left w:val="single" w:color="auto" w:sz="4"/>
+          <w:bottom w:val="single" w:color="auto" w:sz="4"/>
+          <w:right w:val="single" w:color="auto" w:sz="4"/>
+          <w:insideH w:val="single" w:color="auto" w:sz="4"/>
+          <w:insideV w:val="single" w:color="auto" w:sz="4"/>
+        </w:tblBorders>
+      </w:tblPr>
+      <w:tblGrid>
+        <w:gridCol w:w="1700"/>
+        <w:gridCol w:w="4660"/>
+        <w:gridCol w:w="3000"/>
+      </w:tblGrid>
+      <w:tr>
+        <w:trPr>
+          <w:tblHeader/>
+        </w:trPr>
+        <w:tc>
+          <w:tcPr>
+            <w:tcW w:type="dxa" w:w="0"/>
+            <w:tcBorders>
+              <w:top w:val="single" w:color="CCCCCC" w:sz="4"/>
+              <w:left w:val="single" w:color="CCCCCC" w:sz="4"/>
+              <w:bottom w:val="single" w:color="CCCCCC" w:sz="4"/>
+              <w:right w:val="single" w:color="CCCCCC" w:sz="4"/>
+            </w:tcBorders>
+            <w:shd w:fill="0B1D3F" w:val="clear"/>
+            <w:tcMar>
+              <w:top w:type="dxa" w:w="100"/>
+              <w:left w:type="dxa" w:w="140"/>
+              <w:bottom w:type="dxa" w:w="100"/>
+              <w:right w:type="dxa" w:w="140"/>
+            </w:tcMar>
+          </w:tcPr>
+          <w:p>
+            <w:r>
+              <w:rPr>
+                <w:b/>
+                <w:bCs/>
+                <w:color w:val="FFFFFF"/>
+                <w:sz w:val="20"/>
+                <w:szCs w:val="20"/>
+              </w:rPr>
+              <w:t xml:space="preserve">Type</w:t>
+            </w:r>
+          </w:p>
+        </w:tc>
+        <w:tc>
+          <w:tcPr>
+            <w:tcW w:type="dxa" w:w="0"/>
+            <w:tcBorders>
+              <w:top w:val="single" w:color="CCCCCC" w:sz="4"/>
+              <w:left w:val="single" w:color="CCCCCC" w:sz="4"/>
+              <w:bottom w:val="single" w:color="CCCCCC" w:sz="4"/>
+              <w:right w:val="single" w:color="CCCCCC" w:sz="4"/>
+            </w:tcBorders>
+            <w:shd w:fill="0B1D3F" w:val="clear"/>
+            <w:tcMar>
+              <w:top w:type="dxa" w:w="100"/>
+              <w:left w:type="dxa" w:w="140"/>
+              <w:bottom w:type="dxa" w:w="100"/>
+              <w:right w:type="dxa" w:w="140"/>
+            </w:tcMar>
+          </w:tcPr>
+          <w:p>
+            <w:r>
+              <w:rPr>
+                <w:b/>
+                <w:bCs/>
+                <w:color w:val="FFFFFF"/>
+                <w:sz w:val="20"/>
+                <w:szCs w:val="20"/>
+              </w:rPr>
+              <w:t xml:space="preserve">What it does</w:t>
+            </w:r>
+          </w:p>
+        </w:tc>
+        <w:tc>
+          <w:tcPr>
+            <w:tcW w:type="dxa" w:w="0"/>
+            <w:tcBorders>
+              <w:top w:val="single" w:color="CCCCCC" w:sz="4"/>
+              <w:left w:val="single" w:color="CCCCCC" w:sz="4"/>
+              <w:bottom w:val="single" w:color="CCCCCC" w:sz="4"/>
+              <w:right w:val="single" w:color="CCCCCC" w:sz="4"/>
+            </w:tcBorders>
+            <w:shd w:fill="0B1D3F" w:val="clear"/>
+            <w:tcMar>
+              <w:top w:type="dxa" w:w="100"/>
+              <w:left w:type="dxa" w:w="140"/>
+              <w:bottom w:type="dxa" w:w="100"/>
+              <w:right w:type="dxa" w:w="140"/>
+            </w:tcMar>
+          </w:tcPr>
+          <w:p>
+            <w:r>
+              <w:rPr>
+                <w:b/>
+                <w:bCs/>
+                <w:color w:val="FFFFFF"/>
+                <w:sz w:val="20"/>
+                <w:szCs w:val="20"/>
+              </w:rPr>
+              <w:t xml:space="preserve">Nodes</w:t>
+            </w:r>
+          </w:p>
+        </w:tc>
+      </w:tr>
+      <w:tr>
+        <w:tc>
+          <w:tcPr>
+            <w:tcW w:type="dxa" w:w="0"/>
+            <w:tcBorders>
+              <w:top w:val="single" w:color="CCCCCC" w:sz="4"/>
+              <w:left w:val="single" w:color="CCCCCC" w:sz="4"/>
+              <w:bottom w:val="single" w:color="CCCCCC" w:sz="4"/>
+              <w:right w:val="single" w:color="CCCCCC" w:sz="4"/>
+            </w:tcBorders>
+            <w:tcMar>
+              <w:top w:type="dxa" w:w="80"/>
+              <w:left w:type="dxa" w:w="140"/>
+              <w:bottom w:type="dxa" w:w="80"/>
+              <w:right w:type="dxa" w:w="140"/>
+            </w:tcMar>
+          </w:tcPr>
+          <w:p>
+            <w:r>
+              <w:rPr>
+                <w:rFonts w:ascii="Arial" w:cs="Arial" w:eastAsia="Arial" w:hAnsi="Arial"/>
+                <w:b/>
+                <w:bCs/>
+                <w:color w:val="0F172A"/>
+                <w:sz w:val="20"/>
+                <w:szCs w:val="20"/>
+              </w:rPr>
+              <w:t xml:space="preserve">Trigger (navy)</w:t>
+            </w:r>
+          </w:p>
+        </w:tc>
+        <w:tc>
+          <w:tcPr>
+            <w:tcW w:type="dxa" w:w="0"/>
+            <w:tcBorders>
+              <w:top w:val="single" w:color="CCCCCC" w:sz="4"/>
+              <w:left w:val="single" w:color="CCCCCC" w:sz="4"/>
+              <w:bottom w:val="single" w:color="CCCCCC" w:sz="4"/>
+              <w:right w:val="single" w:color="CCCCCC" w:sz="4"/>
+            </w:tcBorders>
+            <w:tcMar>
+              <w:top w:type="dxa" w:w="80"/>
+              <w:left w:type="dxa" w:w="140"/>
+              <w:bottom w:type="dxa" w:w="80"/>
+              <w:right w:type="dxa" w:w="140"/>
+            </w:tcMar>
+          </w:tcPr>
+          <w:p>
+            <w:r>
+              <w:rPr>
+                <w:rFonts w:ascii="Arial" w:cs="Arial" w:eastAsia="Arial" w:hAnsi="Arial"/>
+                <w:b w:val="false"/>
+                <w:bCs w:val="false"/>
+                <w:color w:val="0F172A"/>
+                <w:sz w:val="20"/>
+                <w:szCs w:val="20"/>
+              </w:rPr>
+              <w:t xml:space="preserve">Receive webhook + fast 200 ack</w:t>
+            </w:r>
+          </w:p>
+        </w:tc>
+        <w:tc>
+          <w:tcPr>
+            <w:tcW w:type="dxa" w:w="0"/>
+            <w:tcBorders>
+              <w:top w:val="single" w:color="CCCCCC" w:sz="4"/>
+              <w:left w:val="single" w:color="CCCCCC" w:sz="4"/>
+              <w:bottom w:val="single" w:color="CCCCCC" w:sz="4"/>
+              <w:right w:val="single" w:color="CCCCCC" w:sz="4"/>
+            </w:tcBorders>
+            <w:tcMar>
+              <w:top w:type="dxa" w:w="80"/>
+              <w:left w:type="dxa" w:w="140"/>
+              <w:bottom w:type="dxa" w:w="80"/>
+              <w:right w:type="dxa" w:w="140"/>
+            </w:tcMar>
+          </w:tcPr>
+          <w:p>
+            <w:r>
+              <w:rPr>
+                <w:rFonts w:ascii="Arial" w:cs="Arial" w:eastAsia="Arial" w:hAnsi="Arial"/>
+                <w:b w:val="false"/>
+                <w:bCs w:val="false"/>
+                <w:color w:val="0F172A"/>
+                <w:sz w:val="20"/>
+                <w:szCs w:val="20"/>
+              </w:rPr>
+              <w:t xml:space="preserve">Webhook · Respond 200</w:t>
+            </w:r>
+          </w:p>
+        </w:tc>
+      </w:tr>
+      <w:tr>
+        <w:tc>
+          <w:tcPr>
+            <w:tcW w:type="dxa" w:w="0"/>
+            <w:tcBorders>
+              <w:top w:val="single" w:color="CCCCCC" w:sz="4"/>
+              <w:left w:val="single" w:color="CCCCCC" w:sz="4"/>
+              <w:bottom w:val="single" w:color="CCCCCC" w:sz="4"/>
+              <w:right w:val="single" w:color="CCCCCC" w:sz="4"/>
+            </w:tcBorders>
+            <w:tcMar>
+              <w:top w:type="dxa" w:w="80"/>
+              <w:left w:type="dxa" w:w="140"/>
+              <w:bottom w:type="dxa" w:w="80"/>
+              <w:right w:type="dxa" w:w="140"/>
+            </w:tcMar>
+          </w:tcPr>
+          <w:p>
+            <w:r>
+              <w:rPr>
+                <w:rFonts w:ascii="Arial" w:cs="Arial" w:eastAsia="Arial" w:hAnsi="Arial"/>
+                <w:b/>
+                <w:bCs/>
+                <w:color w:val="0F172A"/>
+                <w:sz w:val="20"/>
+                <w:szCs w:val="20"/>
+              </w:rPr>
+              <w:t xml:space="preserve">Code (amber)</w:t>
+            </w:r>
+          </w:p>
+        </w:tc>
+        <w:tc>
+          <w:tcPr>
+            <w:tcW w:type="dxa" w:w="0"/>
+            <w:tcBorders>
+              <w:top w:val="single" w:color="CCCCCC" w:sz="4"/>
+              <w:left w:val="single" w:color="CCCCCC" w:sz="4"/>
+              <w:bottom w:val="single" w:color="CCCCCC" w:sz="4"/>
+              <w:right w:val="single" w:color="CCCCCC" w:sz="4"/>
+            </w:tcBorders>
+            <w:tcMar>
+              <w:top w:type="dxa" w:w="80"/>
+              <w:left w:type="dxa" w:w="140"/>
+              <w:bottom w:type="dxa" w:w="80"/>
+              <w:right w:type="dxa" w:w="140"/>
+            </w:tcMar>
+          </w:tcPr>
+          <w:p>
+            <w:r>
+              <w:rPr>
+                <w:rFonts w:ascii="Arial" w:cs="Arial" w:eastAsia="Arial" w:hAnsi="Arial"/>
+                <w:b w:val="false"/>
+                <w:bCs w:val="false"/>
+                <w:color w:val="0F172A"/>
+                <w:sz w:val="20"/>
+                <w:szCs w:val="20"/>
+              </w:rPr>
+              <w:t xml:space="preserve">JS logic — HMAC, parse, filter, enrich, build bodies</w:t>
+            </w:r>
+          </w:p>
+        </w:tc>
+        <w:tc>
+          <w:tcPr>
+            <w:tcW w:type="dxa" w:w="0"/>
+            <w:tcBorders>
+              <w:top w:val="single" w:color="CCCCCC" w:sz="4"/>
+              <w:left w:val="single" w:color="CCCCCC" w:sz="4"/>
+              <w:bottom w:val="single" w:color="CCCCCC" w:sz="4"/>
+              <w:right w:val="single" w:color="CCCCCC" w:sz="4"/>
+            </w:tcBorders>
+            <w:tcMar>
+              <w:top w:type="dxa" w:w="80"/>
+              <w:left w:type="dxa" w:w="140"/>
+              <w:bottom w:type="dxa" w:w="80"/>
+              <w:right w:type="dxa" w:w="140"/>
+            </w:tcMar>
+          </w:tcPr>
+          <w:p>
+            <w:r>
+              <w:rPr>
+                <w:rFonts w:ascii="Arial" w:cs="Arial" w:eastAsia="Arial" w:hAnsi="Arial"/>
+                <w:b w:val="false"/>
+                <w:bCs w:val="false"/>
+                <w:color w:val="0F172A"/>
+                <w:sz w:val="20"/>
+                <w:szCs w:val="20"/>
+              </w:rPr>
+              <w:t xml:space="preserve">Verify HMAC · Extract Fields · Filter Files · Decode+Build · Parse Findings · Filter Sev</w:t>
+            </w:r>
+          </w:p>
+        </w:tc>
+      </w:tr>
+      <w:tr>
+        <w:tc>
+          <w:tcPr>
+            <w:tcW w:type="dxa" w:w="0"/>
+            <w:tcBorders>
+              <w:top w:val="single" w:color="CCCCCC" w:sz="4"/>
+              <w:left w:val="single" w:color="CCCCCC" w:sz="4"/>
+              <w:bottom w:val="single" w:color="CCCCCC" w:sz="4"/>
+              <w:right w:val="single" w:color="CCCCCC" w:sz="4"/>
+            </w:tcBorders>
+            <w:tcMar>
+              <w:top w:type="dxa" w:w="80"/>
+              <w:left w:type="dxa" w:w="140"/>
+              <w:bottom w:type="dxa" w:w="80"/>
+              <w:right w:type="dxa" w:w="140"/>
+            </w:tcMar>
+          </w:tcPr>
+          <w:p>
+            <w:r>
+              <w:rPr>
+                <w:rFonts w:ascii="Arial" w:cs="Arial" w:eastAsia="Arial" w:hAnsi="Arial"/>
+                <w:b/>
+                <w:bCs/>
+                <w:color w:val="0F172A"/>
+                <w:sz w:val="20"/>
+                <w:szCs w:val="20"/>
+              </w:rPr>
+              <w:t xml:space="preserve">HTTP (blue)</w:t>
+            </w:r>
+          </w:p>
+        </w:tc>
+        <w:tc>
+          <w:tcPr>
+            <w:tcW w:type="dxa" w:w="0"/>
+            <w:tcBorders>
+              <w:top w:val="single" w:color="CCCCCC" w:sz="4"/>
+              <w:left w:val="single" w:color="CCCCCC" w:sz="4"/>
+              <w:bottom w:val="single" w:color="CCCCCC" w:sz="4"/>
+              <w:right w:val="single" w:color="CCCCCC" w:sz="4"/>
+            </w:tcBorders>
+            <w:tcMar>
+              <w:top w:type="dxa" w:w="80"/>
+              <w:left w:type="dxa" w:w="140"/>
+              <w:bottom w:type="dxa" w:w="80"/>
+              <w:right w:type="dxa" w:w="140"/>
+            </w:tcMar>
+          </w:tcPr>
+          <w:p>
+            <w:r>
+              <w:rPr>
+                <w:rFonts w:ascii="Arial" w:cs="Arial" w:eastAsia="Arial" w:hAnsi="Arial"/>
+                <w:b w:val="false"/>
+                <w:bCs w:val="false"/>
+                <w:color w:val="0F172A"/>
+                <w:sz w:val="20"/>
+                <w:szCs w:val="20"/>
+              </w:rPr>
+              <w:t xml:space="preserve">External API calls to GitHub + Claude</w:t>
+            </w:r>
+          </w:p>
+        </w:tc>
+        <w:tc>
+          <w:tcPr>
+            <w:tcW w:type="dxa" w:w="0"/>
+            <w:tcBorders>
+              <w:top w:val="single" w:color="CCCCCC" w:sz="4"/>
+              <w:left w:val="single" w:color="CCCCCC" w:sz="4"/>
+              <w:bottom w:val="single" w:color="CCCCCC" w:sz="4"/>
+              <w:right w:val="single" w:color="CCCCCC" w:sz="4"/>
+            </w:tcBorders>
+            <w:tcMar>
+              <w:top w:type="dxa" w:w="80"/>
+              <w:left w:type="dxa" w:w="140"/>
+              <w:bottom w:type="dxa" w:w="80"/>
+              <w:right w:type="dxa" w:w="140"/>
+            </w:tcMar>
+          </w:tcPr>
+          <w:p>
+            <w:r>
+              <w:rPr>
+                <w:rFonts w:ascii="Arial" w:cs="Arial" w:eastAsia="Arial" w:hAnsi="Arial"/>
+                <w:b w:val="false"/>
+                <w:bCs w:val="false"/>
+                <w:color w:val="0F172A"/>
+                <w:sz w:val="20"/>
+                <w:szCs w:val="20"/>
+              </w:rPr>
+              <w:t xml:space="preserve">Get PR Files · Get Content · Call Claude · Post Inline · Post Summary</w:t>
+            </w:r>
+          </w:p>
+        </w:tc>
+      </w:tr>
+      <w:tr>
+        <w:tc>
+          <w:tcPr>
+            <w:tcW w:type="dxa" w:w="0"/>
+            <w:tcBorders>
+              <w:top w:val="single" w:color="CCCCCC" w:sz="4"/>
+              <w:left w:val="single" w:color="CCCCCC" w:sz="4"/>
+              <w:bottom w:val="single" w:color="CCCCCC" w:sz="4"/>
+              <w:right w:val="single" w:color="CCCCCC" w:sz="4"/>
+            </w:tcBorders>
+            <w:tcMar>
+              <w:top w:type="dxa" w:w="80"/>
+              <w:left w:type="dxa" w:w="140"/>
+              <w:bottom w:type="dxa" w:w="80"/>
+              <w:right w:type="dxa" w:w="140"/>
+            </w:tcMar>
+          </w:tcPr>
+          <w:p>
+            <w:r>
+              <w:rPr>
+                <w:rFonts w:ascii="Arial" w:cs="Arial" w:eastAsia="Arial" w:hAnsi="Arial"/>
+                <w:b/>
+                <w:bCs/>
+                <w:color w:val="0F172A"/>
+                <w:sz w:val="20"/>
+                <w:szCs w:val="20"/>
+              </w:rPr>
+              <w:t xml:space="preserve">Postgres (green)</w:t>
+            </w:r>
+          </w:p>
+        </w:tc>
+        <w:tc>
+          <w:tcPr>
+            <w:tcW w:type="dxa" w:w="0"/>
+            <w:tcBorders>
+              <w:top w:val="single" w:color="CCCCCC" w:sz="4"/>
+              <w:left w:val="single" w:color="CCCCCC" w:sz="4"/>
+              <w:bottom w:val="single" w:color="CCCCCC" w:sz="4"/>
+              <w:right w:val="single" w:color="CCCCCC" w:sz="4"/>
+            </w:tcBorders>
+            <w:tcMar>
+              <w:top w:type="dxa" w:w="80"/>
+              <w:left w:type="dxa" w:w="140"/>
+              <w:bottom w:type="dxa" w:w="80"/>
+              <w:right w:type="dxa" w:w="140"/>
+            </w:tcMar>
+          </w:tcPr>
+          <w:p>
+            <w:r>
+              <w:rPr>
+                <w:rFonts w:ascii="Arial" w:cs="Arial" w:eastAsia="Arial" w:hAnsi="Arial"/>
+                <w:b w:val="false"/>
+                <w:bCs w:val="false"/>
+                <w:color w:val="0F172A"/>
+                <w:sz w:val="20"/>
+                <w:szCs w:val="20"/>
+              </w:rPr>
+              <w:t xml:space="preserve">Persist PR + findings + read totals</w:t>
+            </w:r>
+          </w:p>
+        </w:tc>
+        <w:tc>
+          <w:tcPr>
+            <w:tcW w:type="dxa" w:w="0"/>
+            <w:tcBorders>
+              <w:top w:val="single" w:color="CCCCCC" w:sz="4"/>
+              <w:left w:val="single" w:color="CCCCCC" w:sz="4"/>
+              <w:bottom w:val="single" w:color="CCCCCC" w:sz="4"/>
+              <w:right w:val="single" w:color="CCCCCC" w:sz="4"/>
+            </w:tcBorders>
+            <w:tcMar>
+              <w:top w:type="dxa" w:w="80"/>
+              <w:left w:type="dxa" w:w="140"/>
+              <w:bottom w:type="dxa" w:w="80"/>
+              <w:right w:type="dxa" w:w="140"/>
+            </w:tcMar>
+          </w:tcPr>
+          <w:p>
+            <w:r>
+              <w:rPr>
+                <w:rFonts w:ascii="Arial" w:cs="Arial" w:eastAsia="Arial" w:hAnsi="Arial"/>
+                <w:b w:val="false"/>
+                <w:bCs w:val="false"/>
+                <w:color w:val="0F172A"/>
+                <w:sz w:val="20"/>
+                <w:szCs w:val="20"/>
+              </w:rPr>
+              <w:t xml:space="preserve">Upsert PR Row · Insert Finding · Count Findings</w:t>
+            </w:r>
+          </w:p>
+        </w:tc>
+      </w:tr>
+      <w:tr>
+        <w:tc>
+          <w:tcPr>
+            <w:tcW w:type="dxa" w:w="0"/>
+            <w:tcBorders>
+              <w:top w:val="single" w:color="CCCCCC" w:sz="4"/>
+              <w:left w:val="single" w:color="CCCCCC" w:sz="4"/>
+              <w:bottom w:val="single" w:color="CCCCCC" w:sz="4"/>
+              <w:right w:val="single" w:color="CCCCCC" w:sz="4"/>
+            </w:tcBorders>
+            <w:tcMar>
+              <w:top w:type="dxa" w:w="80"/>
+              <w:left w:type="dxa" w:w="140"/>
+              <w:bottom w:type="dxa" w:w="80"/>
+              <w:right w:type="dxa" w:w="140"/>
+            </w:tcMar>
+          </w:tcPr>
+          <w:p>
+            <w:r>
+              <w:rPr>
+                <w:rFonts w:ascii="Arial" w:cs="Arial" w:eastAsia="Arial" w:hAnsi="Arial"/>
+                <w:b/>
+                <w:bCs/>
+                <w:color w:val="0F172A"/>
+                <w:sz w:val="20"/>
+                <w:szCs w:val="20"/>
+              </w:rPr>
+              <w:t xml:space="preserve">IF / Split (rose/violet)</w:t>
+            </w:r>
+          </w:p>
+        </w:tc>
+        <w:tc>
+          <w:tcPr>
+            <w:tcW w:type="dxa" w:w="0"/>
+            <w:tcBorders>
+              <w:top w:val="single" w:color="CCCCCC" w:sz="4"/>
+              <w:left w:val="single" w:color="CCCCCC" w:sz="4"/>
+              <w:bottom w:val="single" w:color="CCCCCC" w:sz="4"/>
+              <w:right w:val="single" w:color="CCCCCC" w:sz="4"/>
+            </w:tcBorders>
+            <w:tcMar>
+              <w:top w:type="dxa" w:w="80"/>
+              <w:left w:type="dxa" w:w="140"/>
+              <w:bottom w:type="dxa" w:w="80"/>
+              <w:right w:type="dxa" w:w="140"/>
+            </w:tcMar>
+          </w:tcPr>
+          <w:p>
+            <w:r>
+              <w:rPr>
+                <w:rFonts w:ascii="Arial" w:cs="Arial" w:eastAsia="Arial" w:hAnsi="Arial"/>
+                <w:b w:val="false"/>
+                <w:bCs w:val="false"/>
+                <w:color w:val="0F172A"/>
+                <w:sz w:val="20"/>
+                <w:szCs w:val="20"/>
+              </w:rPr>
+              <w:t xml:space="preserve">Branch by action; loop per file; split findings</w:t>
+            </w:r>
+          </w:p>
+        </w:tc>
+        <w:tc>
+          <w:tcPr>
+            <w:tcW w:type="dxa" w:w="0"/>
+            <w:tcBorders>
+              <w:top w:val="single" w:color="CCCCCC" w:sz="4"/>
+              <w:left w:val="single" w:color="CCCCCC" w:sz="4"/>
+              <w:bottom w:val="single" w:color="CCCCCC" w:sz="4"/>
+              <w:right w:val="single" w:color="CCCCCC" w:sz="4"/>
+            </w:tcBorders>
+            <w:tcMar>
+              <w:top w:type="dxa" w:w="80"/>
+              <w:left w:type="dxa" w:w="140"/>
+              <w:bottom w:type="dxa" w:w="80"/>
+              <w:right w:type="dxa" w:w="140"/>
+            </w:tcMar>
+          </w:tcPr>
+          <w:p>
+            <w:r>
+              <w:rPr>
+                <w:rFonts w:ascii="Arial" w:cs="Arial" w:eastAsia="Arial" w:hAnsi="Arial"/>
+                <w:b w:val="false"/>
+                <w:bCs w:val="false"/>
+                <w:color w:val="0F172A"/>
+                <w:sz w:val="20"/>
+                <w:szCs w:val="20"/>
+              </w:rPr>
+              <w:t xml:space="preserve">IF opened · Split Files · Split Findings</w:t>
+            </w:r>
+          </w:p>
+        </w:tc>
+      </w:tr>
+    </w:tbl>
+    <w:p>
+      <w:r>
+        <w:t xml:space="preserve"/>
       </w:r>
     </w:p>
     <w:p>
@@ -3483,7 +4369,7 @@
         <w:spacing w:after="80" w:before="80"/>
       </w:pPr>
       <w:r>
-        <w:t xml:space="preserve">Total wall-clock latency for a typical three-file PR is approximately eight to fifteen seconds end-to-end, dominated by the Claude API calls.</w:t>
+        <w:t xml:space="preserve">Total latency for a 3-file PR: 8–15 seconds end-to-end, dominated by Claude API calls.</w:t>
       </w:r>
     </w:p>
     <w:p>
@@ -3595,85 +4481,1839 @@
         <w:spacing w:after="80" w:before="80"/>
       </w:pPr>
       <w:r>
-        <w:t xml:space="preserve">The project is organized as a single repository containing all infrastructure code, frontend source, backend workflow specifications, database schema, and supporting documentation.</w:t>
-      </w:r>
-    </w:p>
-    <w:p>
-      <w:pPr>
-        <w:shd w:fill="F8FAFC" w:val="clear"/>
-        <w:spacing w:after="60" w:before="60"/>
-      </w:pPr>
-      <w:r>
-        <w:rPr>
-          <w:rFonts w:ascii="Consolas" w:cs="Consolas" w:eastAsia="Consolas" w:hAnsi="Consolas"/>
-          <w:color w:val="0F172A"/>
-          <w:sz w:val="18"/>
-          <w:szCs w:val="18"/>
-        </w:rPr>
-        <w:t xml:space="preserve">proitbridge-reviewai/
-├── README.md                      Top-level overview with deploy badges
-├── DEPLOYMENT.md                  Step-by-step Railway + Vercel + GitHub guide
-├── PROJECT_BRIEF.md               Original product brief
-├── .github/workflows/
-│   └── weekly-digest.yml          Monday 09:00 IST GitHub Actions cron
-├── n8n/                           Workflow specifications + JSON exports
-│   ├── README.md                  Overview of all 4 workflows
-│   ├── pr-review.md               Main reviewer spec (16 nodes)
-│   ├── pr-review.json             Importable n8n workflow JSON (19 nodes)
-│   ├── pr-resync.md               Re-review on push spec
-│   ├── pr-merged.md               Merge-changelog spec
-│   └── weekly-digest.md           Weekly digest spec
-├── frontend/                      Next.js 14 + Tailwind dashboard
-│   ├── app/                       App router pages
-│   │   ├── layout.tsx             Root layout, brand metadata
-│   │   ├── page.tsx               Landing page composition
-│   │   ├── how-it-works/page.tsx  Pipeline deep-dive
-│   │   ├── pricing/page.tsx       3-tier mock pricing
-│   │   ├── docs/page.tsx          Setup guide for forkers
-│   │   └── dashboard/
-│   │       ├── layout.tsx         AppShell wrapper
-│   │       ├── page.tsx           Live PR queue (server component)
-│   │       ├── findings/page.tsx  All findings table
-│   │       ├── analytics/page.tsx Charts + weekly-digest preview
-│   │       └── settings/page.tsx  Per-repo configuration
-│   ├── components/
-│   │   ├── ui/                    Section, StatCard, SeverityBadge, etc.
-│   │   ├── shell/                 Sidebar, Topbar, AppShell, MarketingNav
-│   │   ├── landing/               Hero, DemoSection, BeforeAfter, etc.
-│   │   ├── dashboard/             PRRow, FindingsClient, charts, AutoRefreshChip
-│   │   └── workflow/              WorkflowFlow (React Flow)
-│   ├── lib/
-│   │   ├── db.ts                  Postgres connection pool
-│   │   ├── queries.ts             Dashboard queries with mock fallback
-│   │   ├── types.ts               Shared TypeScript types
-│   │   ├── utils.ts               cn, timeAgo, severity helpers
-│   │   └── mockData.ts            Bundled demo fixtures
-│   ├── public/
-│   │   └── proitbridge-logo.png   Brand mark
-│   ├── package.json
-│   ├── tailwind.config.ts         Brand palette
-│   ├── tsconfig.json
-│   ├── next.config.js
-│   └── vercel.json
-├── prompts/
-│   ├── reviewer.txt               Claude system prompt for code review
-│   └── digest.txt                 Claude prompt for weekly digest
-├── postgres/
-│   └── schema.sql                 prs, findings, resolutions, repo_config + 4 views
-├── demo-bad-prs/                  Scripted bad PR fixtures for video
-│   ├── README.md
-│   ├── 01-sql-injection.md
-│   ├── 02-missing-tests.md
-│   ├── 03-perf-issue.md
-│   ├── 04-hardcoded-secret.md
-│   └── 05-race-condition.md
-└── scripts/                       Operations + maintenance scripts
-    ├── apply-schema.js            Apply postgres/schema.sql
-    ├── seed-demo-data.js          Insert 15 demo PRs + 29 findings
-    ├── validate-workflow.js       Pre-import shape-check for n8n JSON
-    └── generate-report.js         This document generator</w:t>
-      </w:r>
-    </w:p>
+        <w:t xml:space="preserve">One repo, six top-level folders. The table below shows where every concern lives.</w:t>
+      </w:r>
+    </w:p>
+    <w:p>
+      <w:pPr>
+        <w:pStyle w:val="Heading2"/>
+      </w:pPr>
+      <w:r>
+        <w:t xml:space="preserve">8.1 Top-Level Folders</w:t>
+      </w:r>
+    </w:p>
+    <w:tbl>
+      <w:tblPr>
+        <w:tblW w:type="dxa" w:w="9360"/>
+        <w:tblBorders>
+          <w:top w:val="single" w:color="auto" w:sz="4"/>
+          <w:left w:val="single" w:color="auto" w:sz="4"/>
+          <w:bottom w:val="single" w:color="auto" w:sz="4"/>
+          <w:right w:val="single" w:color="auto" w:sz="4"/>
+          <w:insideH w:val="single" w:color="auto" w:sz="4"/>
+          <w:insideV w:val="single" w:color="auto" w:sz="4"/>
+        </w:tblBorders>
+      </w:tblPr>
+      <w:tblGrid>
+        <w:gridCol w:w="2400"/>
+        <w:gridCol w:w="6960"/>
+      </w:tblGrid>
+      <w:tr>
+        <w:trPr>
+          <w:tblHeader/>
+        </w:trPr>
+        <w:tc>
+          <w:tcPr>
+            <w:tcW w:type="dxa" w:w="0"/>
+            <w:tcBorders>
+              <w:top w:val="single" w:color="CCCCCC" w:sz="4"/>
+              <w:left w:val="single" w:color="CCCCCC" w:sz="4"/>
+              <w:bottom w:val="single" w:color="CCCCCC" w:sz="4"/>
+              <w:right w:val="single" w:color="CCCCCC" w:sz="4"/>
+            </w:tcBorders>
+            <w:shd w:fill="0B1D3F" w:val="clear"/>
+            <w:tcMar>
+              <w:top w:type="dxa" w:w="100"/>
+              <w:left w:type="dxa" w:w="140"/>
+              <w:bottom w:type="dxa" w:w="100"/>
+              <w:right w:type="dxa" w:w="140"/>
+            </w:tcMar>
+          </w:tcPr>
+          <w:p>
+            <w:r>
+              <w:rPr>
+                <w:b/>
+                <w:bCs/>
+                <w:color w:val="FFFFFF"/>
+                <w:sz w:val="20"/>
+                <w:szCs w:val="20"/>
+              </w:rPr>
+              <w:t xml:space="preserve">Folder / File</w:t>
+            </w:r>
+          </w:p>
+        </w:tc>
+        <w:tc>
+          <w:tcPr>
+            <w:tcW w:type="dxa" w:w="0"/>
+            <w:tcBorders>
+              <w:top w:val="single" w:color="CCCCCC" w:sz="4"/>
+              <w:left w:val="single" w:color="CCCCCC" w:sz="4"/>
+              <w:bottom w:val="single" w:color="CCCCCC" w:sz="4"/>
+              <w:right w:val="single" w:color="CCCCCC" w:sz="4"/>
+            </w:tcBorders>
+            <w:shd w:fill="0B1D3F" w:val="clear"/>
+            <w:tcMar>
+              <w:top w:type="dxa" w:w="100"/>
+              <w:left w:type="dxa" w:w="140"/>
+              <w:bottom w:type="dxa" w:w="100"/>
+              <w:right w:type="dxa" w:w="140"/>
+            </w:tcMar>
+          </w:tcPr>
+          <w:p>
+            <w:r>
+              <w:rPr>
+                <w:b/>
+                <w:bCs/>
+                <w:color w:val="FFFFFF"/>
+                <w:sz w:val="20"/>
+                <w:szCs w:val="20"/>
+              </w:rPr>
+              <w:t xml:space="preserve">Purpose</w:t>
+            </w:r>
+          </w:p>
+        </w:tc>
+      </w:tr>
+      <w:tr>
+        <w:tc>
+          <w:tcPr>
+            <w:tcW w:type="dxa" w:w="0"/>
+            <w:tcBorders>
+              <w:top w:val="single" w:color="CCCCCC" w:sz="4"/>
+              <w:left w:val="single" w:color="CCCCCC" w:sz="4"/>
+              <w:bottom w:val="single" w:color="CCCCCC" w:sz="4"/>
+              <w:right w:val="single" w:color="CCCCCC" w:sz="4"/>
+            </w:tcBorders>
+            <w:tcMar>
+              <w:top w:type="dxa" w:w="80"/>
+              <w:left w:type="dxa" w:w="140"/>
+              <w:bottom w:type="dxa" w:w="80"/>
+              <w:right w:type="dxa" w:w="140"/>
+            </w:tcMar>
+          </w:tcPr>
+          <w:p>
+            <w:r>
+              <w:rPr>
+                <w:rFonts w:ascii="Consolas" w:cs="Consolas" w:eastAsia="Consolas" w:hAnsi="Consolas"/>
+                <w:b/>
+                <w:bCs/>
+                <w:color w:val="0F172A"/>
+                <w:sz w:val="18"/>
+                <w:szCs w:val="18"/>
+              </w:rPr>
+              <w:t xml:space="preserve">README.md</w:t>
+            </w:r>
+          </w:p>
+        </w:tc>
+        <w:tc>
+          <w:tcPr>
+            <w:tcW w:type="dxa" w:w="0"/>
+            <w:tcBorders>
+              <w:top w:val="single" w:color="CCCCCC" w:sz="4"/>
+              <w:left w:val="single" w:color="CCCCCC" w:sz="4"/>
+              <w:bottom w:val="single" w:color="CCCCCC" w:sz="4"/>
+              <w:right w:val="single" w:color="CCCCCC" w:sz="4"/>
+            </w:tcBorders>
+            <w:tcMar>
+              <w:top w:type="dxa" w:w="80"/>
+              <w:left w:type="dxa" w:w="140"/>
+              <w:bottom w:type="dxa" w:w="80"/>
+              <w:right w:type="dxa" w:w="140"/>
+            </w:tcMar>
+          </w:tcPr>
+          <w:p>
+            <w:r>
+              <w:rPr>
+                <w:rFonts w:ascii="Arial" w:cs="Arial" w:eastAsia="Arial" w:hAnsi="Arial"/>
+                <w:b w:val="false"/>
+                <w:bCs w:val="false"/>
+                <w:color w:val="0F172A"/>
+                <w:sz w:val="20"/>
+                <w:szCs w:val="20"/>
+              </w:rPr>
+              <w:t xml:space="preserve">60-second pitch · architecture diagram · quick start</w:t>
+            </w:r>
+          </w:p>
+        </w:tc>
+      </w:tr>
+      <w:tr>
+        <w:tc>
+          <w:tcPr>
+            <w:tcW w:type="dxa" w:w="0"/>
+            <w:tcBorders>
+              <w:top w:val="single" w:color="CCCCCC" w:sz="4"/>
+              <w:left w:val="single" w:color="CCCCCC" w:sz="4"/>
+              <w:bottom w:val="single" w:color="CCCCCC" w:sz="4"/>
+              <w:right w:val="single" w:color="CCCCCC" w:sz="4"/>
+            </w:tcBorders>
+            <w:tcMar>
+              <w:top w:type="dxa" w:w="80"/>
+              <w:left w:type="dxa" w:w="140"/>
+              <w:bottom w:type="dxa" w:w="80"/>
+              <w:right w:type="dxa" w:w="140"/>
+            </w:tcMar>
+          </w:tcPr>
+          <w:p>
+            <w:r>
+              <w:rPr>
+                <w:rFonts w:ascii="Consolas" w:cs="Consolas" w:eastAsia="Consolas" w:hAnsi="Consolas"/>
+                <w:b/>
+                <w:bCs/>
+                <w:color w:val="0F172A"/>
+                <w:sz w:val="18"/>
+                <w:szCs w:val="18"/>
+              </w:rPr>
+              <w:t xml:space="preserve">DEPLOYMENT.md</w:t>
+            </w:r>
+          </w:p>
+        </w:tc>
+        <w:tc>
+          <w:tcPr>
+            <w:tcW w:type="dxa" w:w="0"/>
+            <w:tcBorders>
+              <w:top w:val="single" w:color="CCCCCC" w:sz="4"/>
+              <w:left w:val="single" w:color="CCCCCC" w:sz="4"/>
+              <w:bottom w:val="single" w:color="CCCCCC" w:sz="4"/>
+              <w:right w:val="single" w:color="CCCCCC" w:sz="4"/>
+            </w:tcBorders>
+            <w:tcMar>
+              <w:top w:type="dxa" w:w="80"/>
+              <w:left w:type="dxa" w:w="140"/>
+              <w:bottom w:type="dxa" w:w="80"/>
+              <w:right w:type="dxa" w:w="140"/>
+            </w:tcMar>
+          </w:tcPr>
+          <w:p>
+            <w:r>
+              <w:rPr>
+                <w:rFonts w:ascii="Arial" w:cs="Arial" w:eastAsia="Arial" w:hAnsi="Arial"/>
+                <w:b w:val="false"/>
+                <w:bCs w:val="false"/>
+                <w:color w:val="0F172A"/>
+                <w:sz w:val="20"/>
+                <w:szCs w:val="20"/>
+              </w:rPr>
+              <w:t xml:space="preserve">Phased Railway + Vercel + GitHub webhook walkthrough</w:t>
+            </w:r>
+          </w:p>
+        </w:tc>
+      </w:tr>
+      <w:tr>
+        <w:tc>
+          <w:tcPr>
+            <w:tcW w:type="dxa" w:w="0"/>
+            <w:tcBorders>
+              <w:top w:val="single" w:color="CCCCCC" w:sz="4"/>
+              <w:left w:val="single" w:color="CCCCCC" w:sz="4"/>
+              <w:bottom w:val="single" w:color="CCCCCC" w:sz="4"/>
+              <w:right w:val="single" w:color="CCCCCC" w:sz="4"/>
+            </w:tcBorders>
+            <w:tcMar>
+              <w:top w:type="dxa" w:w="80"/>
+              <w:left w:type="dxa" w:w="140"/>
+              <w:bottom w:type="dxa" w:w="80"/>
+              <w:right w:type="dxa" w:w="140"/>
+            </w:tcMar>
+          </w:tcPr>
+          <w:p>
+            <w:r>
+              <w:rPr>
+                <w:rFonts w:ascii="Consolas" w:cs="Consolas" w:eastAsia="Consolas" w:hAnsi="Consolas"/>
+                <w:b/>
+                <w:bCs/>
+                <w:color w:val="0F172A"/>
+                <w:sz w:val="18"/>
+                <w:szCs w:val="18"/>
+              </w:rPr>
+              <w:t xml:space="preserve">.github/workflows/</w:t>
+            </w:r>
+          </w:p>
+        </w:tc>
+        <w:tc>
+          <w:tcPr>
+            <w:tcW w:type="dxa" w:w="0"/>
+            <w:tcBorders>
+              <w:top w:val="single" w:color="CCCCCC" w:sz="4"/>
+              <w:left w:val="single" w:color="CCCCCC" w:sz="4"/>
+              <w:bottom w:val="single" w:color="CCCCCC" w:sz="4"/>
+              <w:right w:val="single" w:color="CCCCCC" w:sz="4"/>
+            </w:tcBorders>
+            <w:tcMar>
+              <w:top w:type="dxa" w:w="80"/>
+              <w:left w:type="dxa" w:w="140"/>
+              <w:bottom w:type="dxa" w:w="80"/>
+              <w:right w:type="dxa" w:w="140"/>
+            </w:tcMar>
+          </w:tcPr>
+          <w:p>
+            <w:r>
+              <w:rPr>
+                <w:rFonts w:ascii="Arial" w:cs="Arial" w:eastAsia="Arial" w:hAnsi="Arial"/>
+                <w:b w:val="false"/>
+                <w:bCs w:val="false"/>
+                <w:color w:val="0F172A"/>
+                <w:sz w:val="20"/>
+                <w:szCs w:val="20"/>
+              </w:rPr>
+              <w:t xml:space="preserve">GitHub Actions — weekly-digest.yml fires Mondays 09:00 IST</w:t>
+            </w:r>
+          </w:p>
+        </w:tc>
+      </w:tr>
+      <w:tr>
+        <w:tc>
+          <w:tcPr>
+            <w:tcW w:type="dxa" w:w="0"/>
+            <w:tcBorders>
+              <w:top w:val="single" w:color="CCCCCC" w:sz="4"/>
+              <w:left w:val="single" w:color="CCCCCC" w:sz="4"/>
+              <w:bottom w:val="single" w:color="CCCCCC" w:sz="4"/>
+              <w:right w:val="single" w:color="CCCCCC" w:sz="4"/>
+            </w:tcBorders>
+            <w:tcMar>
+              <w:top w:type="dxa" w:w="80"/>
+              <w:left w:type="dxa" w:w="140"/>
+              <w:bottom w:type="dxa" w:w="80"/>
+              <w:right w:type="dxa" w:w="140"/>
+            </w:tcMar>
+          </w:tcPr>
+          <w:p>
+            <w:r>
+              <w:rPr>
+                <w:rFonts w:ascii="Consolas" w:cs="Consolas" w:eastAsia="Consolas" w:hAnsi="Consolas"/>
+                <w:b/>
+                <w:bCs/>
+                <w:color w:val="0F172A"/>
+                <w:sz w:val="18"/>
+                <w:szCs w:val="18"/>
+              </w:rPr>
+              <w:t xml:space="preserve">n8n/</w:t>
+            </w:r>
+          </w:p>
+        </w:tc>
+        <w:tc>
+          <w:tcPr>
+            <w:tcW w:type="dxa" w:w="0"/>
+            <w:tcBorders>
+              <w:top w:val="single" w:color="CCCCCC" w:sz="4"/>
+              <w:left w:val="single" w:color="CCCCCC" w:sz="4"/>
+              <w:bottom w:val="single" w:color="CCCCCC" w:sz="4"/>
+              <w:right w:val="single" w:color="CCCCCC" w:sz="4"/>
+            </w:tcBorders>
+            <w:tcMar>
+              <w:top w:type="dxa" w:w="80"/>
+              <w:left w:type="dxa" w:w="140"/>
+              <w:bottom w:type="dxa" w:w="80"/>
+              <w:right w:type="dxa" w:w="140"/>
+            </w:tcMar>
+          </w:tcPr>
+          <w:p>
+            <w:r>
+              <w:rPr>
+                <w:rFonts w:ascii="Arial" w:cs="Arial" w:eastAsia="Arial" w:hAnsi="Arial"/>
+                <w:b w:val="false"/>
+                <w:bCs w:val="false"/>
+                <w:color w:val="0F172A"/>
+                <w:sz w:val="20"/>
+                <w:szCs w:val="20"/>
+              </w:rPr>
+              <w:t xml:space="preserve">Workflow specs (markdown) + importable JSON for pr-review</w:t>
+            </w:r>
+          </w:p>
+        </w:tc>
+      </w:tr>
+      <w:tr>
+        <w:tc>
+          <w:tcPr>
+            <w:tcW w:type="dxa" w:w="0"/>
+            <w:tcBorders>
+              <w:top w:val="single" w:color="CCCCCC" w:sz="4"/>
+              <w:left w:val="single" w:color="CCCCCC" w:sz="4"/>
+              <w:bottom w:val="single" w:color="CCCCCC" w:sz="4"/>
+              <w:right w:val="single" w:color="CCCCCC" w:sz="4"/>
+            </w:tcBorders>
+            <w:tcMar>
+              <w:top w:type="dxa" w:w="80"/>
+              <w:left w:type="dxa" w:w="140"/>
+              <w:bottom w:type="dxa" w:w="80"/>
+              <w:right w:type="dxa" w:w="140"/>
+            </w:tcMar>
+          </w:tcPr>
+          <w:p>
+            <w:r>
+              <w:rPr>
+                <w:rFonts w:ascii="Consolas" w:cs="Consolas" w:eastAsia="Consolas" w:hAnsi="Consolas"/>
+                <w:b/>
+                <w:bCs/>
+                <w:color w:val="0F172A"/>
+                <w:sz w:val="18"/>
+                <w:szCs w:val="18"/>
+              </w:rPr>
+              <w:t xml:space="preserve">frontend/</w:t>
+            </w:r>
+          </w:p>
+        </w:tc>
+        <w:tc>
+          <w:tcPr>
+            <w:tcW w:type="dxa" w:w="0"/>
+            <w:tcBorders>
+              <w:top w:val="single" w:color="CCCCCC" w:sz="4"/>
+              <w:left w:val="single" w:color="CCCCCC" w:sz="4"/>
+              <w:bottom w:val="single" w:color="CCCCCC" w:sz="4"/>
+              <w:right w:val="single" w:color="CCCCCC" w:sz="4"/>
+            </w:tcBorders>
+            <w:tcMar>
+              <w:top w:type="dxa" w:w="80"/>
+              <w:left w:type="dxa" w:w="140"/>
+              <w:bottom w:type="dxa" w:w="80"/>
+              <w:right w:type="dxa" w:w="140"/>
+            </w:tcMar>
+          </w:tcPr>
+          <w:p>
+            <w:r>
+              <w:rPr>
+                <w:rFonts w:ascii="Arial" w:cs="Arial" w:eastAsia="Arial" w:hAnsi="Arial"/>
+                <w:b w:val="false"/>
+                <w:bCs w:val="false"/>
+                <w:color w:val="0F172A"/>
+                <w:sz w:val="20"/>
+                <w:szCs w:val="20"/>
+              </w:rPr>
+              <w:t xml:space="preserve">Next.js 14 dashboard — landing, docs, /dashboard/* pages</w:t>
+            </w:r>
+          </w:p>
+        </w:tc>
+      </w:tr>
+      <w:tr>
+        <w:tc>
+          <w:tcPr>
+            <w:tcW w:type="dxa" w:w="0"/>
+            <w:tcBorders>
+              <w:top w:val="single" w:color="CCCCCC" w:sz="4"/>
+              <w:left w:val="single" w:color="CCCCCC" w:sz="4"/>
+              <w:bottom w:val="single" w:color="CCCCCC" w:sz="4"/>
+              <w:right w:val="single" w:color="CCCCCC" w:sz="4"/>
+            </w:tcBorders>
+            <w:tcMar>
+              <w:top w:type="dxa" w:w="80"/>
+              <w:left w:type="dxa" w:w="140"/>
+              <w:bottom w:type="dxa" w:w="80"/>
+              <w:right w:type="dxa" w:w="140"/>
+            </w:tcMar>
+          </w:tcPr>
+          <w:p>
+            <w:r>
+              <w:rPr>
+                <w:rFonts w:ascii="Consolas" w:cs="Consolas" w:eastAsia="Consolas" w:hAnsi="Consolas"/>
+                <w:b/>
+                <w:bCs/>
+                <w:color w:val="0F172A"/>
+                <w:sz w:val="18"/>
+                <w:szCs w:val="18"/>
+              </w:rPr>
+              <w:t xml:space="preserve">prompts/</w:t>
+            </w:r>
+          </w:p>
+        </w:tc>
+        <w:tc>
+          <w:tcPr>
+            <w:tcW w:type="dxa" w:w="0"/>
+            <w:tcBorders>
+              <w:top w:val="single" w:color="CCCCCC" w:sz="4"/>
+              <w:left w:val="single" w:color="CCCCCC" w:sz="4"/>
+              <w:bottom w:val="single" w:color="CCCCCC" w:sz="4"/>
+              <w:right w:val="single" w:color="CCCCCC" w:sz="4"/>
+            </w:tcBorders>
+            <w:tcMar>
+              <w:top w:type="dxa" w:w="80"/>
+              <w:left w:type="dxa" w:w="140"/>
+              <w:bottom w:type="dxa" w:w="80"/>
+              <w:right w:type="dxa" w:w="140"/>
+            </w:tcMar>
+          </w:tcPr>
+          <w:p>
+            <w:r>
+              <w:rPr>
+                <w:rFonts w:ascii="Arial" w:cs="Arial" w:eastAsia="Arial" w:hAnsi="Arial"/>
+                <w:b w:val="false"/>
+                <w:bCs w:val="false"/>
+                <w:color w:val="0F172A"/>
+                <w:sz w:val="20"/>
+                <w:szCs w:val="20"/>
+              </w:rPr>
+              <w:t xml:space="preserve">Claude system prompts — reviewer.txt + digest.txt</w:t>
+            </w:r>
+          </w:p>
+        </w:tc>
+      </w:tr>
+      <w:tr>
+        <w:tc>
+          <w:tcPr>
+            <w:tcW w:type="dxa" w:w="0"/>
+            <w:tcBorders>
+              <w:top w:val="single" w:color="CCCCCC" w:sz="4"/>
+              <w:left w:val="single" w:color="CCCCCC" w:sz="4"/>
+              <w:bottom w:val="single" w:color="CCCCCC" w:sz="4"/>
+              <w:right w:val="single" w:color="CCCCCC" w:sz="4"/>
+            </w:tcBorders>
+            <w:tcMar>
+              <w:top w:type="dxa" w:w="80"/>
+              <w:left w:type="dxa" w:w="140"/>
+              <w:bottom w:type="dxa" w:w="80"/>
+              <w:right w:type="dxa" w:w="140"/>
+            </w:tcMar>
+          </w:tcPr>
+          <w:p>
+            <w:r>
+              <w:rPr>
+                <w:rFonts w:ascii="Consolas" w:cs="Consolas" w:eastAsia="Consolas" w:hAnsi="Consolas"/>
+                <w:b/>
+                <w:bCs/>
+                <w:color w:val="0F172A"/>
+                <w:sz w:val="18"/>
+                <w:szCs w:val="18"/>
+              </w:rPr>
+              <w:t xml:space="preserve">postgres/</w:t>
+            </w:r>
+          </w:p>
+        </w:tc>
+        <w:tc>
+          <w:tcPr>
+            <w:tcW w:type="dxa" w:w="0"/>
+            <w:tcBorders>
+              <w:top w:val="single" w:color="CCCCCC" w:sz="4"/>
+              <w:left w:val="single" w:color="CCCCCC" w:sz="4"/>
+              <w:bottom w:val="single" w:color="CCCCCC" w:sz="4"/>
+              <w:right w:val="single" w:color="CCCCCC" w:sz="4"/>
+            </w:tcBorders>
+            <w:tcMar>
+              <w:top w:type="dxa" w:w="80"/>
+              <w:left w:type="dxa" w:w="140"/>
+              <w:bottom w:type="dxa" w:w="80"/>
+              <w:right w:type="dxa" w:w="140"/>
+            </w:tcMar>
+          </w:tcPr>
+          <w:p>
+            <w:r>
+              <w:rPr>
+                <w:rFonts w:ascii="Arial" w:cs="Arial" w:eastAsia="Arial" w:hAnsi="Arial"/>
+                <w:b w:val="false"/>
+                <w:bCs w:val="false"/>
+                <w:color w:val="0F172A"/>
+                <w:sz w:val="20"/>
+                <w:szCs w:val="20"/>
+              </w:rPr>
+              <w:t xml:space="preserve">schema.sql — 4 tables + 4 analytics views</w:t>
+            </w:r>
+          </w:p>
+        </w:tc>
+      </w:tr>
+      <w:tr>
+        <w:tc>
+          <w:tcPr>
+            <w:tcW w:type="dxa" w:w="0"/>
+            <w:tcBorders>
+              <w:top w:val="single" w:color="CCCCCC" w:sz="4"/>
+              <w:left w:val="single" w:color="CCCCCC" w:sz="4"/>
+              <w:bottom w:val="single" w:color="CCCCCC" w:sz="4"/>
+              <w:right w:val="single" w:color="CCCCCC" w:sz="4"/>
+            </w:tcBorders>
+            <w:tcMar>
+              <w:top w:type="dxa" w:w="80"/>
+              <w:left w:type="dxa" w:w="140"/>
+              <w:bottom w:type="dxa" w:w="80"/>
+              <w:right w:type="dxa" w:w="140"/>
+            </w:tcMar>
+          </w:tcPr>
+          <w:p>
+            <w:r>
+              <w:rPr>
+                <w:rFonts w:ascii="Consolas" w:cs="Consolas" w:eastAsia="Consolas" w:hAnsi="Consolas"/>
+                <w:b/>
+                <w:bCs/>
+                <w:color w:val="0F172A"/>
+                <w:sz w:val="18"/>
+                <w:szCs w:val="18"/>
+              </w:rPr>
+              <w:t xml:space="preserve">demo-bad-prs/</w:t>
+            </w:r>
+          </w:p>
+        </w:tc>
+        <w:tc>
+          <w:tcPr>
+            <w:tcW w:type="dxa" w:w="0"/>
+            <w:tcBorders>
+              <w:top w:val="single" w:color="CCCCCC" w:sz="4"/>
+              <w:left w:val="single" w:color="CCCCCC" w:sz="4"/>
+              <w:bottom w:val="single" w:color="CCCCCC" w:sz="4"/>
+              <w:right w:val="single" w:color="CCCCCC" w:sz="4"/>
+            </w:tcBorders>
+            <w:tcMar>
+              <w:top w:type="dxa" w:w="80"/>
+              <w:left w:type="dxa" w:w="140"/>
+              <w:bottom w:type="dxa" w:w="80"/>
+              <w:right w:type="dxa" w:w="140"/>
+            </w:tcMar>
+          </w:tcPr>
+          <w:p>
+            <w:r>
+              <w:rPr>
+                <w:rFonts w:ascii="Arial" w:cs="Arial" w:eastAsia="Arial" w:hAnsi="Arial"/>
+                <w:b w:val="false"/>
+                <w:bCs w:val="false"/>
+                <w:color w:val="0F172A"/>
+                <w:sz w:val="20"/>
+                <w:szCs w:val="20"/>
+              </w:rPr>
+              <w:t xml:space="preserve">5 scripted bad-PR fixtures for video recording</w:t>
+            </w:r>
+          </w:p>
+        </w:tc>
+      </w:tr>
+      <w:tr>
+        <w:tc>
+          <w:tcPr>
+            <w:tcW w:type="dxa" w:w="0"/>
+            <w:tcBorders>
+              <w:top w:val="single" w:color="CCCCCC" w:sz="4"/>
+              <w:left w:val="single" w:color="CCCCCC" w:sz="4"/>
+              <w:bottom w:val="single" w:color="CCCCCC" w:sz="4"/>
+              <w:right w:val="single" w:color="CCCCCC" w:sz="4"/>
+            </w:tcBorders>
+            <w:tcMar>
+              <w:top w:type="dxa" w:w="80"/>
+              <w:left w:type="dxa" w:w="140"/>
+              <w:bottom w:type="dxa" w:w="80"/>
+              <w:right w:type="dxa" w:w="140"/>
+            </w:tcMar>
+          </w:tcPr>
+          <w:p>
+            <w:r>
+              <w:rPr>
+                <w:rFonts w:ascii="Consolas" w:cs="Consolas" w:eastAsia="Consolas" w:hAnsi="Consolas"/>
+                <w:b/>
+                <w:bCs/>
+                <w:color w:val="0F172A"/>
+                <w:sz w:val="18"/>
+                <w:szCs w:val="18"/>
+              </w:rPr>
+              <w:t xml:space="preserve">scripts/</w:t>
+            </w:r>
+          </w:p>
+        </w:tc>
+        <w:tc>
+          <w:tcPr>
+            <w:tcW w:type="dxa" w:w="0"/>
+            <w:tcBorders>
+              <w:top w:val="single" w:color="CCCCCC" w:sz="4"/>
+              <w:left w:val="single" w:color="CCCCCC" w:sz="4"/>
+              <w:bottom w:val="single" w:color="CCCCCC" w:sz="4"/>
+              <w:right w:val="single" w:color="CCCCCC" w:sz="4"/>
+            </w:tcBorders>
+            <w:tcMar>
+              <w:top w:type="dxa" w:w="80"/>
+              <w:left w:type="dxa" w:w="140"/>
+              <w:bottom w:type="dxa" w:w="80"/>
+              <w:right w:type="dxa" w:w="140"/>
+            </w:tcMar>
+          </w:tcPr>
+          <w:p>
+            <w:r>
+              <w:rPr>
+                <w:rFonts w:ascii="Arial" w:cs="Arial" w:eastAsia="Arial" w:hAnsi="Arial"/>
+                <w:b w:val="false"/>
+                <w:bCs w:val="false"/>
+                <w:color w:val="0F172A"/>
+                <w:sz w:val="20"/>
+                <w:szCs w:val="20"/>
+              </w:rPr>
+              <w:t xml:space="preserve">Apply schema · seed demo data · validate workflow · generate report · render diagrams</w:t>
+            </w:r>
+          </w:p>
+        </w:tc>
+      </w:tr>
+      <w:tr>
+        <w:tc>
+          <w:tcPr>
+            <w:tcW w:type="dxa" w:w="0"/>
+            <w:tcBorders>
+              <w:top w:val="single" w:color="CCCCCC" w:sz="4"/>
+              <w:left w:val="single" w:color="CCCCCC" w:sz="4"/>
+              <w:bottom w:val="single" w:color="CCCCCC" w:sz="4"/>
+              <w:right w:val="single" w:color="CCCCCC" w:sz="4"/>
+            </w:tcBorders>
+            <w:tcMar>
+              <w:top w:type="dxa" w:w="80"/>
+              <w:left w:type="dxa" w:w="140"/>
+              <w:bottom w:type="dxa" w:w="80"/>
+              <w:right w:type="dxa" w:w="140"/>
+            </w:tcMar>
+          </w:tcPr>
+          <w:p>
+            <w:r>
+              <w:rPr>
+                <w:rFonts w:ascii="Consolas" w:cs="Consolas" w:eastAsia="Consolas" w:hAnsi="Consolas"/>
+                <w:b/>
+                <w:bCs/>
+                <w:color w:val="0F172A"/>
+                <w:sz w:val="18"/>
+                <w:szCs w:val="18"/>
+              </w:rPr>
+              <w:t xml:space="preserve">assets/</w:t>
+            </w:r>
+          </w:p>
+        </w:tc>
+        <w:tc>
+          <w:tcPr>
+            <w:tcW w:type="dxa" w:w="0"/>
+            <w:tcBorders>
+              <w:top w:val="single" w:color="CCCCCC" w:sz="4"/>
+              <w:left w:val="single" w:color="CCCCCC" w:sz="4"/>
+              <w:bottom w:val="single" w:color="CCCCCC" w:sz="4"/>
+              <w:right w:val="single" w:color="CCCCCC" w:sz="4"/>
+            </w:tcBorders>
+            <w:tcMar>
+              <w:top w:type="dxa" w:w="80"/>
+              <w:left w:type="dxa" w:w="140"/>
+              <w:bottom w:type="dxa" w:w="80"/>
+              <w:right w:type="dxa" w:w="140"/>
+            </w:tcMar>
+          </w:tcPr>
+          <w:p>
+            <w:r>
+              <w:rPr>
+                <w:rFonts w:ascii="Arial" w:cs="Arial" w:eastAsia="Arial" w:hAnsi="Arial"/>
+                <w:b w:val="false"/>
+                <w:bCs w:val="false"/>
+                <w:color w:val="0F172A"/>
+                <w:sz w:val="20"/>
+                <w:szCs w:val="20"/>
+              </w:rPr>
+              <w:t xml:space="preserve">Generated PNG diagrams used by this report</w:t>
+            </w:r>
+          </w:p>
+        </w:tc>
+      </w:tr>
+    </w:tbl>
+    <w:p>
+      <w:r>
+        <w:t xml:space="preserve"/>
+      </w:r>
+    </w:p>
+    <w:p>
+      <w:pPr>
+        <w:pStyle w:val="Heading2"/>
+      </w:pPr>
+      <w:r>
+        <w:t xml:space="preserve">8.2 frontend/ Detail</w:t>
+      </w:r>
+    </w:p>
+    <w:tbl>
+      <w:tblPr>
+        <w:tblW w:type="dxa" w:w="9360"/>
+        <w:tblBorders>
+          <w:top w:val="single" w:color="auto" w:sz="4"/>
+          <w:left w:val="single" w:color="auto" w:sz="4"/>
+          <w:bottom w:val="single" w:color="auto" w:sz="4"/>
+          <w:right w:val="single" w:color="auto" w:sz="4"/>
+          <w:insideH w:val="single" w:color="auto" w:sz="4"/>
+          <w:insideV w:val="single" w:color="auto" w:sz="4"/>
+        </w:tblBorders>
+      </w:tblPr>
+      <w:tblGrid>
+        <w:gridCol w:w="3400"/>
+        <w:gridCol w:w="5960"/>
+      </w:tblGrid>
+      <w:tr>
+        <w:trPr>
+          <w:tblHeader/>
+        </w:trPr>
+        <w:tc>
+          <w:tcPr>
+            <w:tcW w:type="dxa" w:w="0"/>
+            <w:tcBorders>
+              <w:top w:val="single" w:color="CCCCCC" w:sz="4"/>
+              <w:left w:val="single" w:color="CCCCCC" w:sz="4"/>
+              <w:bottom w:val="single" w:color="CCCCCC" w:sz="4"/>
+              <w:right w:val="single" w:color="CCCCCC" w:sz="4"/>
+            </w:tcBorders>
+            <w:shd w:fill="0B1D3F" w:val="clear"/>
+            <w:tcMar>
+              <w:top w:type="dxa" w:w="100"/>
+              <w:left w:type="dxa" w:w="140"/>
+              <w:bottom w:type="dxa" w:w="100"/>
+              <w:right w:type="dxa" w:w="140"/>
+            </w:tcMar>
+          </w:tcPr>
+          <w:p>
+            <w:r>
+              <w:rPr>
+                <w:b/>
+                <w:bCs/>
+                <w:color w:val="FFFFFF"/>
+                <w:sz w:val="20"/>
+                <w:szCs w:val="20"/>
+              </w:rPr>
+              <w:t xml:space="preserve">Path</w:t>
+            </w:r>
+          </w:p>
+        </w:tc>
+        <w:tc>
+          <w:tcPr>
+            <w:tcW w:type="dxa" w:w="0"/>
+            <w:tcBorders>
+              <w:top w:val="single" w:color="CCCCCC" w:sz="4"/>
+              <w:left w:val="single" w:color="CCCCCC" w:sz="4"/>
+              <w:bottom w:val="single" w:color="CCCCCC" w:sz="4"/>
+              <w:right w:val="single" w:color="CCCCCC" w:sz="4"/>
+            </w:tcBorders>
+            <w:shd w:fill="0B1D3F" w:val="clear"/>
+            <w:tcMar>
+              <w:top w:type="dxa" w:w="100"/>
+              <w:left w:type="dxa" w:w="140"/>
+              <w:bottom w:type="dxa" w:w="100"/>
+              <w:right w:type="dxa" w:w="140"/>
+            </w:tcMar>
+          </w:tcPr>
+          <w:p>
+            <w:r>
+              <w:rPr>
+                <w:b/>
+                <w:bCs/>
+                <w:color w:val="FFFFFF"/>
+                <w:sz w:val="20"/>
+                <w:szCs w:val="20"/>
+              </w:rPr>
+              <w:t xml:space="preserve">What's there</w:t>
+            </w:r>
+          </w:p>
+        </w:tc>
+      </w:tr>
+      <w:tr>
+        <w:tc>
+          <w:tcPr>
+            <w:tcW w:type="dxa" w:w="0"/>
+            <w:tcBorders>
+              <w:top w:val="single" w:color="CCCCCC" w:sz="4"/>
+              <w:left w:val="single" w:color="CCCCCC" w:sz="4"/>
+              <w:bottom w:val="single" w:color="CCCCCC" w:sz="4"/>
+              <w:right w:val="single" w:color="CCCCCC" w:sz="4"/>
+            </w:tcBorders>
+            <w:tcMar>
+              <w:top w:type="dxa" w:w="80"/>
+              <w:left w:type="dxa" w:w="140"/>
+              <w:bottom w:type="dxa" w:w="80"/>
+              <w:right w:type="dxa" w:w="140"/>
+            </w:tcMar>
+          </w:tcPr>
+          <w:p>
+            <w:r>
+              <w:rPr>
+                <w:rFonts w:ascii="Consolas" w:cs="Consolas" w:eastAsia="Consolas" w:hAnsi="Consolas"/>
+                <w:b w:val="false"/>
+                <w:bCs w:val="false"/>
+                <w:color w:val="0F172A"/>
+                <w:sz w:val="18"/>
+                <w:szCs w:val="18"/>
+              </w:rPr>
+              <w:t xml:space="preserve">app/page.tsx</w:t>
+            </w:r>
+          </w:p>
+        </w:tc>
+        <w:tc>
+          <w:tcPr>
+            <w:tcW w:type="dxa" w:w="0"/>
+            <w:tcBorders>
+              <w:top w:val="single" w:color="CCCCCC" w:sz="4"/>
+              <w:left w:val="single" w:color="CCCCCC" w:sz="4"/>
+              <w:bottom w:val="single" w:color="CCCCCC" w:sz="4"/>
+              <w:right w:val="single" w:color="CCCCCC" w:sz="4"/>
+            </w:tcBorders>
+            <w:tcMar>
+              <w:top w:type="dxa" w:w="80"/>
+              <w:left w:type="dxa" w:w="140"/>
+              <w:bottom w:type="dxa" w:w="80"/>
+              <w:right w:type="dxa" w:w="140"/>
+            </w:tcMar>
+          </w:tcPr>
+          <w:p>
+            <w:r>
+              <w:rPr>
+                <w:rFonts w:ascii="Arial" w:cs="Arial" w:eastAsia="Arial" w:hAnsi="Arial"/>
+                <w:b w:val="false"/>
+                <w:bCs w:val="false"/>
+                <w:color w:val="0F172A"/>
+                <w:sz w:val="20"/>
+                <w:szCs w:val="20"/>
+              </w:rPr>
+              <w:t xml:space="preserve">Landing page — composes Hero, Demo, How It Works, Pricing</w:t>
+            </w:r>
+          </w:p>
+        </w:tc>
+      </w:tr>
+      <w:tr>
+        <w:tc>
+          <w:tcPr>
+            <w:tcW w:type="dxa" w:w="0"/>
+            <w:tcBorders>
+              <w:top w:val="single" w:color="CCCCCC" w:sz="4"/>
+              <w:left w:val="single" w:color="CCCCCC" w:sz="4"/>
+              <w:bottom w:val="single" w:color="CCCCCC" w:sz="4"/>
+              <w:right w:val="single" w:color="CCCCCC" w:sz="4"/>
+            </w:tcBorders>
+            <w:tcMar>
+              <w:top w:type="dxa" w:w="80"/>
+              <w:left w:type="dxa" w:w="140"/>
+              <w:bottom w:type="dxa" w:w="80"/>
+              <w:right w:type="dxa" w:w="140"/>
+            </w:tcMar>
+          </w:tcPr>
+          <w:p>
+            <w:r>
+              <w:rPr>
+                <w:rFonts w:ascii="Consolas" w:cs="Consolas" w:eastAsia="Consolas" w:hAnsi="Consolas"/>
+                <w:b w:val="false"/>
+                <w:bCs w:val="false"/>
+                <w:color w:val="0F172A"/>
+                <w:sz w:val="18"/>
+                <w:szCs w:val="18"/>
+              </w:rPr>
+              <w:t xml:space="preserve">app/dashboard/page.tsx</w:t>
+            </w:r>
+          </w:p>
+        </w:tc>
+        <w:tc>
+          <w:tcPr>
+            <w:tcW w:type="dxa" w:w="0"/>
+            <w:tcBorders>
+              <w:top w:val="single" w:color="CCCCCC" w:sz="4"/>
+              <w:left w:val="single" w:color="CCCCCC" w:sz="4"/>
+              <w:bottom w:val="single" w:color="CCCCCC" w:sz="4"/>
+              <w:right w:val="single" w:color="CCCCCC" w:sz="4"/>
+            </w:tcBorders>
+            <w:tcMar>
+              <w:top w:type="dxa" w:w="80"/>
+              <w:left w:type="dxa" w:w="140"/>
+              <w:bottom w:type="dxa" w:w="80"/>
+              <w:right w:type="dxa" w:w="140"/>
+            </w:tcMar>
+          </w:tcPr>
+          <w:p>
+            <w:r>
+              <w:rPr>
+                <w:rFonts w:ascii="Arial" w:cs="Arial" w:eastAsia="Arial" w:hAnsi="Arial"/>
+                <w:b w:val="false"/>
+                <w:bCs w:val="false"/>
+                <w:color w:val="0F172A"/>
+                <w:sz w:val="20"/>
+                <w:szCs w:val="20"/>
+              </w:rPr>
+              <w:t xml:space="preserve">Live PR Queue — server component, queries Postgres</w:t>
+            </w:r>
+          </w:p>
+        </w:tc>
+      </w:tr>
+      <w:tr>
+        <w:tc>
+          <w:tcPr>
+            <w:tcW w:type="dxa" w:w="0"/>
+            <w:tcBorders>
+              <w:top w:val="single" w:color="CCCCCC" w:sz="4"/>
+              <w:left w:val="single" w:color="CCCCCC" w:sz="4"/>
+              <w:bottom w:val="single" w:color="CCCCCC" w:sz="4"/>
+              <w:right w:val="single" w:color="CCCCCC" w:sz="4"/>
+            </w:tcBorders>
+            <w:tcMar>
+              <w:top w:type="dxa" w:w="80"/>
+              <w:left w:type="dxa" w:w="140"/>
+              <w:bottom w:type="dxa" w:w="80"/>
+              <w:right w:type="dxa" w:w="140"/>
+            </w:tcMar>
+          </w:tcPr>
+          <w:p>
+            <w:r>
+              <w:rPr>
+                <w:rFonts w:ascii="Consolas" w:cs="Consolas" w:eastAsia="Consolas" w:hAnsi="Consolas"/>
+                <w:b w:val="false"/>
+                <w:bCs w:val="false"/>
+                <w:color w:val="0F172A"/>
+                <w:sz w:val="18"/>
+                <w:szCs w:val="18"/>
+              </w:rPr>
+              <w:t xml:space="preserve">app/dashboard/findings/page.tsx</w:t>
+            </w:r>
+          </w:p>
+        </w:tc>
+        <w:tc>
+          <w:tcPr>
+            <w:tcW w:type="dxa" w:w="0"/>
+            <w:tcBorders>
+              <w:top w:val="single" w:color="CCCCCC" w:sz="4"/>
+              <w:left w:val="single" w:color="CCCCCC" w:sz="4"/>
+              <w:bottom w:val="single" w:color="CCCCCC" w:sz="4"/>
+              <w:right w:val="single" w:color="CCCCCC" w:sz="4"/>
+            </w:tcBorders>
+            <w:tcMar>
+              <w:top w:type="dxa" w:w="80"/>
+              <w:left w:type="dxa" w:w="140"/>
+              <w:bottom w:type="dxa" w:w="80"/>
+              <w:right w:type="dxa" w:w="140"/>
+            </w:tcMar>
+          </w:tcPr>
+          <w:p>
+            <w:r>
+              <w:rPr>
+                <w:rFonts w:ascii="Arial" w:cs="Arial" w:eastAsia="Arial" w:hAnsi="Arial"/>
+                <w:b w:val="false"/>
+                <w:bCs w:val="false"/>
+                <w:color w:val="0F172A"/>
+                <w:sz w:val="20"/>
+                <w:szCs w:val="20"/>
+              </w:rPr>
+              <w:t xml:space="preserve">All Findings table with search + severity/category filters</w:t>
+            </w:r>
+          </w:p>
+        </w:tc>
+      </w:tr>
+      <w:tr>
+        <w:tc>
+          <w:tcPr>
+            <w:tcW w:type="dxa" w:w="0"/>
+            <w:tcBorders>
+              <w:top w:val="single" w:color="CCCCCC" w:sz="4"/>
+              <w:left w:val="single" w:color="CCCCCC" w:sz="4"/>
+              <w:bottom w:val="single" w:color="CCCCCC" w:sz="4"/>
+              <w:right w:val="single" w:color="CCCCCC" w:sz="4"/>
+            </w:tcBorders>
+            <w:tcMar>
+              <w:top w:type="dxa" w:w="80"/>
+              <w:left w:type="dxa" w:w="140"/>
+              <w:bottom w:type="dxa" w:w="80"/>
+              <w:right w:type="dxa" w:w="140"/>
+            </w:tcMar>
+          </w:tcPr>
+          <w:p>
+            <w:r>
+              <w:rPr>
+                <w:rFonts w:ascii="Consolas" w:cs="Consolas" w:eastAsia="Consolas" w:hAnsi="Consolas"/>
+                <w:b w:val="false"/>
+                <w:bCs w:val="false"/>
+                <w:color w:val="0F172A"/>
+                <w:sz w:val="18"/>
+                <w:szCs w:val="18"/>
+              </w:rPr>
+              <w:t xml:space="preserve">app/dashboard/analytics/page.tsx</w:t>
+            </w:r>
+          </w:p>
+        </w:tc>
+        <w:tc>
+          <w:tcPr>
+            <w:tcW w:type="dxa" w:w="0"/>
+            <w:tcBorders>
+              <w:top w:val="single" w:color="CCCCCC" w:sz="4"/>
+              <w:left w:val="single" w:color="CCCCCC" w:sz="4"/>
+              <w:bottom w:val="single" w:color="CCCCCC" w:sz="4"/>
+              <w:right w:val="single" w:color="CCCCCC" w:sz="4"/>
+            </w:tcBorders>
+            <w:tcMar>
+              <w:top w:type="dxa" w:w="80"/>
+              <w:left w:type="dxa" w:w="140"/>
+              <w:bottom w:type="dxa" w:w="80"/>
+              <w:right w:type="dxa" w:w="140"/>
+            </w:tcMar>
+          </w:tcPr>
+          <w:p>
+            <w:r>
+              <w:rPr>
+                <w:rFonts w:ascii="Arial" w:cs="Arial" w:eastAsia="Arial" w:hAnsi="Arial"/>
+                <w:b w:val="false"/>
+                <w:bCs w:val="false"/>
+                <w:color w:val="0F172A"/>
+                <w:sz w:val="20"/>
+                <w:szCs w:val="20"/>
+              </w:rPr>
+              <w:t xml:space="preserve">Severity trend + category donut + accept-rate + top files</w:t>
+            </w:r>
+          </w:p>
+        </w:tc>
+      </w:tr>
+      <w:tr>
+        <w:tc>
+          <w:tcPr>
+            <w:tcW w:type="dxa" w:w="0"/>
+            <w:tcBorders>
+              <w:top w:val="single" w:color="CCCCCC" w:sz="4"/>
+              <w:left w:val="single" w:color="CCCCCC" w:sz="4"/>
+              <w:bottom w:val="single" w:color="CCCCCC" w:sz="4"/>
+              <w:right w:val="single" w:color="CCCCCC" w:sz="4"/>
+            </w:tcBorders>
+            <w:tcMar>
+              <w:top w:type="dxa" w:w="80"/>
+              <w:left w:type="dxa" w:w="140"/>
+              <w:bottom w:type="dxa" w:w="80"/>
+              <w:right w:type="dxa" w:w="140"/>
+            </w:tcMar>
+          </w:tcPr>
+          <w:p>
+            <w:r>
+              <w:rPr>
+                <w:rFonts w:ascii="Consolas" w:cs="Consolas" w:eastAsia="Consolas" w:hAnsi="Consolas"/>
+                <w:b w:val="false"/>
+                <w:bCs w:val="false"/>
+                <w:color w:val="0F172A"/>
+                <w:sz w:val="18"/>
+                <w:szCs w:val="18"/>
+              </w:rPr>
+              <w:t xml:space="preserve">app/dashboard/settings/page.tsx</w:t>
+            </w:r>
+          </w:p>
+        </w:tc>
+        <w:tc>
+          <w:tcPr>
+            <w:tcW w:type="dxa" w:w="0"/>
+            <w:tcBorders>
+              <w:top w:val="single" w:color="CCCCCC" w:sz="4"/>
+              <w:left w:val="single" w:color="CCCCCC" w:sz="4"/>
+              <w:bottom w:val="single" w:color="CCCCCC" w:sz="4"/>
+              <w:right w:val="single" w:color="CCCCCC" w:sz="4"/>
+            </w:tcBorders>
+            <w:tcMar>
+              <w:top w:type="dxa" w:w="80"/>
+              <w:left w:type="dxa" w:w="140"/>
+              <w:bottom w:type="dxa" w:w="80"/>
+              <w:right w:type="dxa" w:w="140"/>
+            </w:tcMar>
+          </w:tcPr>
+          <w:p>
+            <w:r>
+              <w:rPr>
+                <w:rFonts w:ascii="Arial" w:cs="Arial" w:eastAsia="Arial" w:hAnsi="Arial"/>
+                <w:b w:val="false"/>
+                <w:bCs w:val="false"/>
+                <w:color w:val="0F172A"/>
+                <w:sz w:val="20"/>
+                <w:szCs w:val="20"/>
+              </w:rPr>
+              <w:t xml:space="preserve">Per-repo config + secrets + Open-n8n CTA</w:t>
+            </w:r>
+          </w:p>
+        </w:tc>
+      </w:tr>
+      <w:tr>
+        <w:tc>
+          <w:tcPr>
+            <w:tcW w:type="dxa" w:w="0"/>
+            <w:tcBorders>
+              <w:top w:val="single" w:color="CCCCCC" w:sz="4"/>
+              <w:left w:val="single" w:color="CCCCCC" w:sz="4"/>
+              <w:bottom w:val="single" w:color="CCCCCC" w:sz="4"/>
+              <w:right w:val="single" w:color="CCCCCC" w:sz="4"/>
+            </w:tcBorders>
+            <w:tcMar>
+              <w:top w:type="dxa" w:w="80"/>
+              <w:left w:type="dxa" w:w="140"/>
+              <w:bottom w:type="dxa" w:w="80"/>
+              <w:right w:type="dxa" w:w="140"/>
+            </w:tcMar>
+          </w:tcPr>
+          <w:p>
+            <w:r>
+              <w:rPr>
+                <w:rFonts w:ascii="Consolas" w:cs="Consolas" w:eastAsia="Consolas" w:hAnsi="Consolas"/>
+                <w:b w:val="false"/>
+                <w:bCs w:val="false"/>
+                <w:color w:val="0F172A"/>
+                <w:sz w:val="18"/>
+                <w:szCs w:val="18"/>
+              </w:rPr>
+              <w:t xml:space="preserve">components/landing/</w:t>
+            </w:r>
+          </w:p>
+        </w:tc>
+        <w:tc>
+          <w:tcPr>
+            <w:tcW w:type="dxa" w:w="0"/>
+            <w:tcBorders>
+              <w:top w:val="single" w:color="CCCCCC" w:sz="4"/>
+              <w:left w:val="single" w:color="CCCCCC" w:sz="4"/>
+              <w:bottom w:val="single" w:color="CCCCCC" w:sz="4"/>
+              <w:right w:val="single" w:color="CCCCCC" w:sz="4"/>
+            </w:tcBorders>
+            <w:tcMar>
+              <w:top w:type="dxa" w:w="80"/>
+              <w:left w:type="dxa" w:w="140"/>
+              <w:bottom w:type="dxa" w:w="80"/>
+              <w:right w:type="dxa" w:w="140"/>
+            </w:tcMar>
+          </w:tcPr>
+          <w:p>
+            <w:r>
+              <w:rPr>
+                <w:rFonts w:ascii="Arial" w:cs="Arial" w:eastAsia="Arial" w:hAnsi="Arial"/>
+                <w:b w:val="false"/>
+                <w:bCs w:val="false"/>
+                <w:color w:val="0F172A"/>
+                <w:sz w:val="20"/>
+                <w:szCs w:val="20"/>
+              </w:rPr>
+              <w:t xml:space="preserve">Hero · DemoSection · BeforeAfter · Pricing · FooterCTA</w:t>
+            </w:r>
+          </w:p>
+        </w:tc>
+      </w:tr>
+      <w:tr>
+        <w:tc>
+          <w:tcPr>
+            <w:tcW w:type="dxa" w:w="0"/>
+            <w:tcBorders>
+              <w:top w:val="single" w:color="CCCCCC" w:sz="4"/>
+              <w:left w:val="single" w:color="CCCCCC" w:sz="4"/>
+              <w:bottom w:val="single" w:color="CCCCCC" w:sz="4"/>
+              <w:right w:val="single" w:color="CCCCCC" w:sz="4"/>
+            </w:tcBorders>
+            <w:tcMar>
+              <w:top w:type="dxa" w:w="80"/>
+              <w:left w:type="dxa" w:w="140"/>
+              <w:bottom w:type="dxa" w:w="80"/>
+              <w:right w:type="dxa" w:w="140"/>
+            </w:tcMar>
+          </w:tcPr>
+          <w:p>
+            <w:r>
+              <w:rPr>
+                <w:rFonts w:ascii="Consolas" w:cs="Consolas" w:eastAsia="Consolas" w:hAnsi="Consolas"/>
+                <w:b w:val="false"/>
+                <w:bCs w:val="false"/>
+                <w:color w:val="0F172A"/>
+                <w:sz w:val="18"/>
+                <w:szCs w:val="18"/>
+              </w:rPr>
+              <w:t xml:space="preserve">components/dashboard/</w:t>
+            </w:r>
+          </w:p>
+        </w:tc>
+        <w:tc>
+          <w:tcPr>
+            <w:tcW w:type="dxa" w:w="0"/>
+            <w:tcBorders>
+              <w:top w:val="single" w:color="CCCCCC" w:sz="4"/>
+              <w:left w:val="single" w:color="CCCCCC" w:sz="4"/>
+              <w:bottom w:val="single" w:color="CCCCCC" w:sz="4"/>
+              <w:right w:val="single" w:color="CCCCCC" w:sz="4"/>
+            </w:tcBorders>
+            <w:tcMar>
+              <w:top w:type="dxa" w:w="80"/>
+              <w:left w:type="dxa" w:w="140"/>
+              <w:bottom w:type="dxa" w:w="80"/>
+              <w:right w:type="dxa" w:w="140"/>
+            </w:tcMar>
+          </w:tcPr>
+          <w:p>
+            <w:r>
+              <w:rPr>
+                <w:rFonts w:ascii="Arial" w:cs="Arial" w:eastAsia="Arial" w:hAnsi="Arial"/>
+                <w:b w:val="false"/>
+                <w:bCs w:val="false"/>
+                <w:color w:val="0F172A"/>
+                <w:sz w:val="20"/>
+                <w:szCs w:val="20"/>
+              </w:rPr>
+              <w:t xml:space="preserve">PRRow · charts · AutoRefreshChip · DataSourcePill</w:t>
+            </w:r>
+          </w:p>
+        </w:tc>
+      </w:tr>
+      <w:tr>
+        <w:tc>
+          <w:tcPr>
+            <w:tcW w:type="dxa" w:w="0"/>
+            <w:tcBorders>
+              <w:top w:val="single" w:color="CCCCCC" w:sz="4"/>
+              <w:left w:val="single" w:color="CCCCCC" w:sz="4"/>
+              <w:bottom w:val="single" w:color="CCCCCC" w:sz="4"/>
+              <w:right w:val="single" w:color="CCCCCC" w:sz="4"/>
+            </w:tcBorders>
+            <w:tcMar>
+              <w:top w:type="dxa" w:w="80"/>
+              <w:left w:type="dxa" w:w="140"/>
+              <w:bottom w:type="dxa" w:w="80"/>
+              <w:right w:type="dxa" w:w="140"/>
+            </w:tcMar>
+          </w:tcPr>
+          <w:p>
+            <w:r>
+              <w:rPr>
+                <w:rFonts w:ascii="Consolas" w:cs="Consolas" w:eastAsia="Consolas" w:hAnsi="Consolas"/>
+                <w:b w:val="false"/>
+                <w:bCs w:val="false"/>
+                <w:color w:val="0F172A"/>
+                <w:sz w:val="18"/>
+                <w:szCs w:val="18"/>
+              </w:rPr>
+              <w:t xml:space="preserve">components/shell/</w:t>
+            </w:r>
+          </w:p>
+        </w:tc>
+        <w:tc>
+          <w:tcPr>
+            <w:tcW w:type="dxa" w:w="0"/>
+            <w:tcBorders>
+              <w:top w:val="single" w:color="CCCCCC" w:sz="4"/>
+              <w:left w:val="single" w:color="CCCCCC" w:sz="4"/>
+              <w:bottom w:val="single" w:color="CCCCCC" w:sz="4"/>
+              <w:right w:val="single" w:color="CCCCCC" w:sz="4"/>
+            </w:tcBorders>
+            <w:tcMar>
+              <w:top w:type="dxa" w:w="80"/>
+              <w:left w:type="dxa" w:w="140"/>
+              <w:bottom w:type="dxa" w:w="80"/>
+              <w:right w:type="dxa" w:w="140"/>
+            </w:tcMar>
+          </w:tcPr>
+          <w:p>
+            <w:r>
+              <w:rPr>
+                <w:rFonts w:ascii="Arial" w:cs="Arial" w:eastAsia="Arial" w:hAnsi="Arial"/>
+                <w:b w:val="false"/>
+                <w:bCs w:val="false"/>
+                <w:color w:val="0F172A"/>
+                <w:sz w:val="20"/>
+                <w:szCs w:val="20"/>
+              </w:rPr>
+              <w:t xml:space="preserve">Sidebar (light) · Topbar (light + Open n8n button) · AppShell</w:t>
+            </w:r>
+          </w:p>
+        </w:tc>
+      </w:tr>
+      <w:tr>
+        <w:tc>
+          <w:tcPr>
+            <w:tcW w:type="dxa" w:w="0"/>
+            <w:tcBorders>
+              <w:top w:val="single" w:color="CCCCCC" w:sz="4"/>
+              <w:left w:val="single" w:color="CCCCCC" w:sz="4"/>
+              <w:bottom w:val="single" w:color="CCCCCC" w:sz="4"/>
+              <w:right w:val="single" w:color="CCCCCC" w:sz="4"/>
+            </w:tcBorders>
+            <w:tcMar>
+              <w:top w:type="dxa" w:w="80"/>
+              <w:left w:type="dxa" w:w="140"/>
+              <w:bottom w:type="dxa" w:w="80"/>
+              <w:right w:type="dxa" w:w="140"/>
+            </w:tcMar>
+          </w:tcPr>
+          <w:p>
+            <w:r>
+              <w:rPr>
+                <w:rFonts w:ascii="Consolas" w:cs="Consolas" w:eastAsia="Consolas" w:hAnsi="Consolas"/>
+                <w:b w:val="false"/>
+                <w:bCs w:val="false"/>
+                <w:color w:val="0F172A"/>
+                <w:sz w:val="18"/>
+                <w:szCs w:val="18"/>
+              </w:rPr>
+              <w:t xml:space="preserve">lib/queries.ts</w:t>
+            </w:r>
+          </w:p>
+        </w:tc>
+        <w:tc>
+          <w:tcPr>
+            <w:tcW w:type="dxa" w:w="0"/>
+            <w:tcBorders>
+              <w:top w:val="single" w:color="CCCCCC" w:sz="4"/>
+              <w:left w:val="single" w:color="CCCCCC" w:sz="4"/>
+              <w:bottom w:val="single" w:color="CCCCCC" w:sz="4"/>
+              <w:right w:val="single" w:color="CCCCCC" w:sz="4"/>
+            </w:tcBorders>
+            <w:tcMar>
+              <w:top w:type="dxa" w:w="80"/>
+              <w:left w:type="dxa" w:w="140"/>
+              <w:bottom w:type="dxa" w:w="80"/>
+              <w:right w:type="dxa" w:w="140"/>
+            </w:tcMar>
+          </w:tcPr>
+          <w:p>
+            <w:r>
+              <w:rPr>
+                <w:rFonts w:ascii="Arial" w:cs="Arial" w:eastAsia="Arial" w:hAnsi="Arial"/>
+                <w:b w:val="false"/>
+                <w:bCs w:val="false"/>
+                <w:color w:val="0F172A"/>
+                <w:sz w:val="20"/>
+                <w:szCs w:val="20"/>
+              </w:rPr>
+              <w:t xml:space="preserve">Postgres queries with mock-data fallback for empty DB</w:t>
+            </w:r>
+          </w:p>
+        </w:tc>
+      </w:tr>
+      <w:tr>
+        <w:tc>
+          <w:tcPr>
+            <w:tcW w:type="dxa" w:w="0"/>
+            <w:tcBorders>
+              <w:top w:val="single" w:color="CCCCCC" w:sz="4"/>
+              <w:left w:val="single" w:color="CCCCCC" w:sz="4"/>
+              <w:bottom w:val="single" w:color="CCCCCC" w:sz="4"/>
+              <w:right w:val="single" w:color="CCCCCC" w:sz="4"/>
+            </w:tcBorders>
+            <w:tcMar>
+              <w:top w:type="dxa" w:w="80"/>
+              <w:left w:type="dxa" w:w="140"/>
+              <w:bottom w:type="dxa" w:w="80"/>
+              <w:right w:type="dxa" w:w="140"/>
+            </w:tcMar>
+          </w:tcPr>
+          <w:p>
+            <w:r>
+              <w:rPr>
+                <w:rFonts w:ascii="Consolas" w:cs="Consolas" w:eastAsia="Consolas" w:hAnsi="Consolas"/>
+                <w:b w:val="false"/>
+                <w:bCs w:val="false"/>
+                <w:color w:val="0F172A"/>
+                <w:sz w:val="18"/>
+                <w:szCs w:val="18"/>
+              </w:rPr>
+              <w:t xml:space="preserve">lib/db.ts</w:t>
+            </w:r>
+          </w:p>
+        </w:tc>
+        <w:tc>
+          <w:tcPr>
+            <w:tcW w:type="dxa" w:w="0"/>
+            <w:tcBorders>
+              <w:top w:val="single" w:color="CCCCCC" w:sz="4"/>
+              <w:left w:val="single" w:color="CCCCCC" w:sz="4"/>
+              <w:bottom w:val="single" w:color="CCCCCC" w:sz="4"/>
+              <w:right w:val="single" w:color="CCCCCC" w:sz="4"/>
+            </w:tcBorders>
+            <w:tcMar>
+              <w:top w:type="dxa" w:w="80"/>
+              <w:left w:type="dxa" w:w="140"/>
+              <w:bottom w:type="dxa" w:w="80"/>
+              <w:right w:type="dxa" w:w="140"/>
+            </w:tcMar>
+          </w:tcPr>
+          <w:p>
+            <w:r>
+              <w:rPr>
+                <w:rFonts w:ascii="Arial" w:cs="Arial" w:eastAsia="Arial" w:hAnsi="Arial"/>
+                <w:b w:val="false"/>
+                <w:bCs w:val="false"/>
+                <w:color w:val="0F172A"/>
+                <w:sz w:val="20"/>
+                <w:szCs w:val="20"/>
+              </w:rPr>
+              <w:t xml:space="preserve">Lazy pg.Pool connection (SSL auto-detected)</w:t>
+            </w:r>
+          </w:p>
+        </w:tc>
+      </w:tr>
+    </w:tbl>
+    <w:p>
+      <w:r>
+        <w:t xml:space="preserve"/>
+      </w:r>
+    </w:p>
+    <w:p>
+      <w:pPr>
+        <w:pStyle w:val="Heading2"/>
+      </w:pPr>
+      <w:r>
+        <w:t xml:space="preserve">8.3 scripts/ Detail</w:t>
+      </w:r>
+    </w:p>
+    <w:tbl>
+      <w:tblPr>
+        <w:tblW w:type="dxa" w:w="9360"/>
+        <w:tblBorders>
+          <w:top w:val="single" w:color="auto" w:sz="4"/>
+          <w:left w:val="single" w:color="auto" w:sz="4"/>
+          <w:bottom w:val="single" w:color="auto" w:sz="4"/>
+          <w:right w:val="single" w:color="auto" w:sz="4"/>
+          <w:insideH w:val="single" w:color="auto" w:sz="4"/>
+          <w:insideV w:val="single" w:color="auto" w:sz="4"/>
+        </w:tblBorders>
+      </w:tblPr>
+      <w:tblGrid>
+        <w:gridCol w:w="3000"/>
+        <w:gridCol w:w="6360"/>
+      </w:tblGrid>
+      <w:tr>
+        <w:trPr>
+          <w:tblHeader/>
+        </w:trPr>
+        <w:tc>
+          <w:tcPr>
+            <w:tcW w:type="dxa" w:w="0"/>
+            <w:tcBorders>
+              <w:top w:val="single" w:color="CCCCCC" w:sz="4"/>
+              <w:left w:val="single" w:color="CCCCCC" w:sz="4"/>
+              <w:bottom w:val="single" w:color="CCCCCC" w:sz="4"/>
+              <w:right w:val="single" w:color="CCCCCC" w:sz="4"/>
+            </w:tcBorders>
+            <w:shd w:fill="0B1D3F" w:val="clear"/>
+            <w:tcMar>
+              <w:top w:type="dxa" w:w="100"/>
+              <w:left w:type="dxa" w:w="140"/>
+              <w:bottom w:type="dxa" w:w="100"/>
+              <w:right w:type="dxa" w:w="140"/>
+            </w:tcMar>
+          </w:tcPr>
+          <w:p>
+            <w:r>
+              <w:rPr>
+                <w:b/>
+                <w:bCs/>
+                <w:color w:val="FFFFFF"/>
+                <w:sz w:val="20"/>
+                <w:szCs w:val="20"/>
+              </w:rPr>
+              <w:t xml:space="preserve">Script</w:t>
+            </w:r>
+          </w:p>
+        </w:tc>
+        <w:tc>
+          <w:tcPr>
+            <w:tcW w:type="dxa" w:w="0"/>
+            <w:tcBorders>
+              <w:top w:val="single" w:color="CCCCCC" w:sz="4"/>
+              <w:left w:val="single" w:color="CCCCCC" w:sz="4"/>
+              <w:bottom w:val="single" w:color="CCCCCC" w:sz="4"/>
+              <w:right w:val="single" w:color="CCCCCC" w:sz="4"/>
+            </w:tcBorders>
+            <w:shd w:fill="0B1D3F" w:val="clear"/>
+            <w:tcMar>
+              <w:top w:type="dxa" w:w="100"/>
+              <w:left w:type="dxa" w:w="140"/>
+              <w:bottom w:type="dxa" w:w="100"/>
+              <w:right w:type="dxa" w:w="140"/>
+            </w:tcMar>
+          </w:tcPr>
+          <w:p>
+            <w:r>
+              <w:rPr>
+                <w:b/>
+                <w:bCs/>
+                <w:color w:val="FFFFFF"/>
+                <w:sz w:val="20"/>
+                <w:szCs w:val="20"/>
+              </w:rPr>
+              <w:t xml:space="preserve">What it does</w:t>
+            </w:r>
+          </w:p>
+        </w:tc>
+      </w:tr>
+      <w:tr>
+        <w:tc>
+          <w:tcPr>
+            <w:tcW w:type="dxa" w:w="0"/>
+            <w:tcBorders>
+              <w:top w:val="single" w:color="CCCCCC" w:sz="4"/>
+              <w:left w:val="single" w:color="CCCCCC" w:sz="4"/>
+              <w:bottom w:val="single" w:color="CCCCCC" w:sz="4"/>
+              <w:right w:val="single" w:color="CCCCCC" w:sz="4"/>
+            </w:tcBorders>
+            <w:tcMar>
+              <w:top w:type="dxa" w:w="80"/>
+              <w:left w:type="dxa" w:w="140"/>
+              <w:bottom w:type="dxa" w:w="80"/>
+              <w:right w:type="dxa" w:w="140"/>
+            </w:tcMar>
+          </w:tcPr>
+          <w:p>
+            <w:r>
+              <w:rPr>
+                <w:rFonts w:ascii="Consolas" w:cs="Consolas" w:eastAsia="Consolas" w:hAnsi="Consolas"/>
+                <w:b/>
+                <w:bCs/>
+                <w:color w:val="0F172A"/>
+                <w:sz w:val="18"/>
+                <w:szCs w:val="18"/>
+              </w:rPr>
+              <w:t xml:space="preserve">apply-schema.js</w:t>
+            </w:r>
+          </w:p>
+        </w:tc>
+        <w:tc>
+          <w:tcPr>
+            <w:tcW w:type="dxa" w:w="0"/>
+            <w:tcBorders>
+              <w:top w:val="single" w:color="CCCCCC" w:sz="4"/>
+              <w:left w:val="single" w:color="CCCCCC" w:sz="4"/>
+              <w:bottom w:val="single" w:color="CCCCCC" w:sz="4"/>
+              <w:right w:val="single" w:color="CCCCCC" w:sz="4"/>
+            </w:tcBorders>
+            <w:tcMar>
+              <w:top w:type="dxa" w:w="80"/>
+              <w:left w:type="dxa" w:w="140"/>
+              <w:bottom w:type="dxa" w:w="80"/>
+              <w:right w:type="dxa" w:w="140"/>
+            </w:tcMar>
+          </w:tcPr>
+          <w:p>
+            <w:r>
+              <w:rPr>
+                <w:rFonts w:ascii="Arial" w:cs="Arial" w:eastAsia="Arial" w:hAnsi="Arial"/>
+                <w:b w:val="false"/>
+                <w:bCs w:val="false"/>
+                <w:color w:val="0F172A"/>
+                <w:sz w:val="20"/>
+                <w:szCs w:val="20"/>
+              </w:rPr>
+              <w:t xml:space="preserve">Apply postgres/schema.sql to Railway Postgres</w:t>
+            </w:r>
+          </w:p>
+        </w:tc>
+      </w:tr>
+      <w:tr>
+        <w:tc>
+          <w:tcPr>
+            <w:tcW w:type="dxa" w:w="0"/>
+            <w:tcBorders>
+              <w:top w:val="single" w:color="CCCCCC" w:sz="4"/>
+              <w:left w:val="single" w:color="CCCCCC" w:sz="4"/>
+              <w:bottom w:val="single" w:color="CCCCCC" w:sz="4"/>
+              <w:right w:val="single" w:color="CCCCCC" w:sz="4"/>
+            </w:tcBorders>
+            <w:tcMar>
+              <w:top w:type="dxa" w:w="80"/>
+              <w:left w:type="dxa" w:w="140"/>
+              <w:bottom w:type="dxa" w:w="80"/>
+              <w:right w:type="dxa" w:w="140"/>
+            </w:tcMar>
+          </w:tcPr>
+          <w:p>
+            <w:r>
+              <w:rPr>
+                <w:rFonts w:ascii="Consolas" w:cs="Consolas" w:eastAsia="Consolas" w:hAnsi="Consolas"/>
+                <w:b/>
+                <w:bCs/>
+                <w:color w:val="0F172A"/>
+                <w:sz w:val="18"/>
+                <w:szCs w:val="18"/>
+              </w:rPr>
+              <w:t xml:space="preserve">seed-demo-data.js</w:t>
+            </w:r>
+          </w:p>
+        </w:tc>
+        <w:tc>
+          <w:tcPr>
+            <w:tcW w:type="dxa" w:w="0"/>
+            <w:tcBorders>
+              <w:top w:val="single" w:color="CCCCCC" w:sz="4"/>
+              <w:left w:val="single" w:color="CCCCCC" w:sz="4"/>
+              <w:bottom w:val="single" w:color="CCCCCC" w:sz="4"/>
+              <w:right w:val="single" w:color="CCCCCC" w:sz="4"/>
+            </w:tcBorders>
+            <w:tcMar>
+              <w:top w:type="dxa" w:w="80"/>
+              <w:left w:type="dxa" w:w="140"/>
+              <w:bottom w:type="dxa" w:w="80"/>
+              <w:right w:type="dxa" w:w="140"/>
+            </w:tcMar>
+          </w:tcPr>
+          <w:p>
+            <w:r>
+              <w:rPr>
+                <w:rFonts w:ascii="Arial" w:cs="Arial" w:eastAsia="Arial" w:hAnsi="Arial"/>
+                <w:b w:val="false"/>
+                <w:bCs w:val="false"/>
+                <w:color w:val="0F172A"/>
+                <w:sz w:val="20"/>
+                <w:szCs w:val="20"/>
+              </w:rPr>
+              <w:t xml:space="preserve">Insert 15 demo PRs + 29 findings (idempotent, re-runnable)</w:t>
+            </w:r>
+          </w:p>
+        </w:tc>
+      </w:tr>
+      <w:tr>
+        <w:tc>
+          <w:tcPr>
+            <w:tcW w:type="dxa" w:w="0"/>
+            <w:tcBorders>
+              <w:top w:val="single" w:color="CCCCCC" w:sz="4"/>
+              <w:left w:val="single" w:color="CCCCCC" w:sz="4"/>
+              <w:bottom w:val="single" w:color="CCCCCC" w:sz="4"/>
+              <w:right w:val="single" w:color="CCCCCC" w:sz="4"/>
+            </w:tcBorders>
+            <w:tcMar>
+              <w:top w:type="dxa" w:w="80"/>
+              <w:left w:type="dxa" w:w="140"/>
+              <w:bottom w:type="dxa" w:w="80"/>
+              <w:right w:type="dxa" w:w="140"/>
+            </w:tcMar>
+          </w:tcPr>
+          <w:p>
+            <w:r>
+              <w:rPr>
+                <w:rFonts w:ascii="Consolas" w:cs="Consolas" w:eastAsia="Consolas" w:hAnsi="Consolas"/>
+                <w:b/>
+                <w:bCs/>
+                <w:color w:val="0F172A"/>
+                <w:sz w:val="18"/>
+                <w:szCs w:val="18"/>
+              </w:rPr>
+              <w:t xml:space="preserve">validate-workflow.js</w:t>
+            </w:r>
+          </w:p>
+        </w:tc>
+        <w:tc>
+          <w:tcPr>
+            <w:tcW w:type="dxa" w:w="0"/>
+            <w:tcBorders>
+              <w:top w:val="single" w:color="CCCCCC" w:sz="4"/>
+              <w:left w:val="single" w:color="CCCCCC" w:sz="4"/>
+              <w:bottom w:val="single" w:color="CCCCCC" w:sz="4"/>
+              <w:right w:val="single" w:color="CCCCCC" w:sz="4"/>
+            </w:tcBorders>
+            <w:tcMar>
+              <w:top w:type="dxa" w:w="80"/>
+              <w:left w:type="dxa" w:w="140"/>
+              <w:bottom w:type="dxa" w:w="80"/>
+              <w:right w:type="dxa" w:w="140"/>
+            </w:tcMar>
+          </w:tcPr>
+          <w:p>
+            <w:r>
+              <w:rPr>
+                <w:rFonts w:ascii="Arial" w:cs="Arial" w:eastAsia="Arial" w:hAnsi="Arial"/>
+                <w:b w:val="false"/>
+                <w:bCs w:val="false"/>
+                <w:color w:val="0F172A"/>
+                <w:sz w:val="20"/>
+                <w:szCs w:val="20"/>
+              </w:rPr>
+              <w:t xml:space="preserve">Shape-check n8n JSON before import (nodes, connections, types)</w:t>
+            </w:r>
+          </w:p>
+        </w:tc>
+      </w:tr>
+      <w:tr>
+        <w:tc>
+          <w:tcPr>
+            <w:tcW w:type="dxa" w:w="0"/>
+            <w:tcBorders>
+              <w:top w:val="single" w:color="CCCCCC" w:sz="4"/>
+              <w:left w:val="single" w:color="CCCCCC" w:sz="4"/>
+              <w:bottom w:val="single" w:color="CCCCCC" w:sz="4"/>
+              <w:right w:val="single" w:color="CCCCCC" w:sz="4"/>
+            </w:tcBorders>
+            <w:tcMar>
+              <w:top w:type="dxa" w:w="80"/>
+              <w:left w:type="dxa" w:w="140"/>
+              <w:bottom w:type="dxa" w:w="80"/>
+              <w:right w:type="dxa" w:w="140"/>
+            </w:tcMar>
+          </w:tcPr>
+          <w:p>
+            <w:r>
+              <w:rPr>
+                <w:rFonts w:ascii="Consolas" w:cs="Consolas" w:eastAsia="Consolas" w:hAnsi="Consolas"/>
+                <w:b/>
+                <w:bCs/>
+                <w:color w:val="0F172A"/>
+                <w:sz w:val="18"/>
+                <w:szCs w:val="18"/>
+              </w:rPr>
+              <w:t xml:space="preserve">generate-diagrams.py</w:t>
+            </w:r>
+          </w:p>
+        </w:tc>
+        <w:tc>
+          <w:tcPr>
+            <w:tcW w:type="dxa" w:w="0"/>
+            <w:tcBorders>
+              <w:top w:val="single" w:color="CCCCCC" w:sz="4"/>
+              <w:left w:val="single" w:color="CCCCCC" w:sz="4"/>
+              <w:bottom w:val="single" w:color="CCCCCC" w:sz="4"/>
+              <w:right w:val="single" w:color="CCCCCC" w:sz="4"/>
+            </w:tcBorders>
+            <w:tcMar>
+              <w:top w:type="dxa" w:w="80"/>
+              <w:left w:type="dxa" w:w="140"/>
+              <w:bottom w:type="dxa" w:w="80"/>
+              <w:right w:type="dxa" w:w="140"/>
+            </w:tcMar>
+          </w:tcPr>
+          <w:p>
+            <w:r>
+              <w:rPr>
+                <w:rFonts w:ascii="Arial" w:cs="Arial" w:eastAsia="Arial" w:hAnsi="Arial"/>
+                <w:b w:val="false"/>
+                <w:bCs w:val="false"/>
+                <w:color w:val="0F172A"/>
+                <w:sz w:val="20"/>
+                <w:szCs w:val="20"/>
+              </w:rPr>
+              <w:t xml:space="preserve">Render the 3 architecture PNGs used in this report</w:t>
+            </w:r>
+          </w:p>
+        </w:tc>
+      </w:tr>
+      <w:tr>
+        <w:tc>
+          <w:tcPr>
+            <w:tcW w:type="dxa" w:w="0"/>
+            <w:tcBorders>
+              <w:top w:val="single" w:color="CCCCCC" w:sz="4"/>
+              <w:left w:val="single" w:color="CCCCCC" w:sz="4"/>
+              <w:bottom w:val="single" w:color="CCCCCC" w:sz="4"/>
+              <w:right w:val="single" w:color="CCCCCC" w:sz="4"/>
+            </w:tcBorders>
+            <w:tcMar>
+              <w:top w:type="dxa" w:w="80"/>
+              <w:left w:type="dxa" w:w="140"/>
+              <w:bottom w:type="dxa" w:w="80"/>
+              <w:right w:type="dxa" w:w="140"/>
+            </w:tcMar>
+          </w:tcPr>
+          <w:p>
+            <w:r>
+              <w:rPr>
+                <w:rFonts w:ascii="Consolas" w:cs="Consolas" w:eastAsia="Consolas" w:hAnsi="Consolas"/>
+                <w:b/>
+                <w:bCs/>
+                <w:color w:val="0F172A"/>
+                <w:sz w:val="18"/>
+                <w:szCs w:val="18"/>
+              </w:rPr>
+              <w:t xml:space="preserve">generate-report.js</w:t>
+            </w:r>
+          </w:p>
+        </w:tc>
+        <w:tc>
+          <w:tcPr>
+            <w:tcW w:type="dxa" w:w="0"/>
+            <w:tcBorders>
+              <w:top w:val="single" w:color="CCCCCC" w:sz="4"/>
+              <w:left w:val="single" w:color="CCCCCC" w:sz="4"/>
+              <w:bottom w:val="single" w:color="CCCCCC" w:sz="4"/>
+              <w:right w:val="single" w:color="CCCCCC" w:sz="4"/>
+            </w:tcBorders>
+            <w:tcMar>
+              <w:top w:type="dxa" w:w="80"/>
+              <w:left w:type="dxa" w:w="140"/>
+              <w:bottom w:type="dxa" w:w="80"/>
+              <w:right w:type="dxa" w:w="140"/>
+            </w:tcMar>
+          </w:tcPr>
+          <w:p>
+            <w:r>
+              <w:rPr>
+                <w:rFonts w:ascii="Arial" w:cs="Arial" w:eastAsia="Arial" w:hAnsi="Arial"/>
+                <w:b w:val="false"/>
+                <w:bCs w:val="false"/>
+                <w:color w:val="0F172A"/>
+                <w:sz w:val="20"/>
+                <w:szCs w:val="20"/>
+              </w:rPr>
+              <w:t xml:space="preserve">Produce this Word document (run with NODE_PATH set to global docx)</w:t>
+            </w:r>
+          </w:p>
+        </w:tc>
+      </w:tr>
+    </w:tbl>
     <w:p>
       <w:pPr>
         <w:pStyle w:val="Heading1"/>
@@ -4999,7 +7639,69 @@
         <w:spacing w:after="80" w:before="80"/>
       </w:pPr>
       <w:r>
-        <w:t xml:space="preserve">The following sample demonstrates a real end-to-end run of the bot against a deliberately broken pull request.</w:t>
+        <w:t xml:space="preserve">A developer opens a PR with one Python file containing a SQL injection bug. The timeline below shows what happens, second by second.</w:t>
+      </w:r>
+    </w:p>
+    <w:p>
+      <w:pPr>
+        <w:spacing w:after="80" w:before="120"/>
+        <w:jc w:val="center"/>
+      </w:pPr>
+      <w:r>
+        <w:drawing>
+          <wp:inline distT="0" distB="0" distL="0" distR="0">
+            <wp:extent cx="5905500" cy="2571750"/>
+            <wp:effectExtent t="0" r="0" b="0" l="0"/>
+            <wp:docPr id="1" name="diagram-sample-run.png" descr="Figure 3 — From git push to bot review in 8.2 seconds." title="Figure 3 — From git push to bot review in 8.2 seconds."/>
+            <wp:cNvGraphicFramePr>
+              <a:graphicFrameLocks xmlns:a="http://schemas.openxmlformats.org/drawingml/2006/main" noChangeAspect="1"/>
+            </wp:cNvGraphicFramePr>
+            <a:graphic xmlns:a="http://schemas.openxmlformats.org/drawingml/2006/main">
+              <a:graphicData uri="http://schemas.openxmlformats.org/drawingml/2006/picture">
+                <pic:pic xmlns:pic="http://schemas.openxmlformats.org/drawingml/2006/picture">
+                  <pic:nvPicPr>
+                    <pic:cNvPr id="0" name="" descr=""/>
+                    <pic:cNvPicPr>
+                      <a:picLocks noChangeAspect="1" noChangeArrowheads="1"/>
+                    </pic:cNvPicPr>
+                  </pic:nvPicPr>
+                  <pic:blipFill>
+                    <a:blip r:embed="rId11" cstate="none"/>
+                    <a:srcRect/>
+                    <a:stretch>
+                      <a:fillRect/>
+                    </a:stretch>
+                  </pic:blipFill>
+                  <pic:spPr bwMode="auto">
+                    <a:xfrm>
+                      <a:off x="0" y="0"/>
+                      <a:ext cx="5905500" cy="2571750"/>
+                    </a:xfrm>
+                    <a:prstGeom prst="rect">
+                      <a:avLst/>
+                    </a:prstGeom>
+                  </pic:spPr>
+                </pic:pic>
+              </a:graphicData>
+            </a:graphic>
+          </wp:inline>
+        </w:drawing>
+      </w:r>
+    </w:p>
+    <w:p>
+      <w:pPr>
+        <w:spacing w:after="160" w:before="0"/>
+        <w:jc w:val="center"/>
+      </w:pPr>
+      <w:r>
+        <w:rPr>
+          <w:i/>
+          <w:iCs/>
+          <w:color w:val="64748B"/>
+          <w:sz w:val="18"/>
+          <w:szCs w:val="18"/>
+        </w:rPr>
+        <w:t xml:space="preserve">Figure 3 — From git push to bot review in 8.2 seconds.</w:t>
       </w:r>
     </w:p>
     <w:p>
@@ -5007,15 +7709,7 @@
         <w:pStyle w:val="Heading2"/>
       </w:pPr>
       <w:r>
-        <w:t xml:space="preserve">12.1 Step 1: Open a Bad PR</w:t>
-      </w:r>
-    </w:p>
-    <w:p>
-      <w:pPr>
-        <w:spacing w:after="80" w:before="80"/>
-      </w:pPr>
-      <w:r>
-        <w:t xml:space="preserve">From the demo repository, create a branch containing a Python file with a SQL injection vulnerability.</w:t>
+        <w:t xml:space="preserve">12.1 The Trigger — One Command</w:t>
       </w:r>
     </w:p>
     <w:p>
@@ -5030,22 +7724,34 @@
           <w:sz w:val="18"/>
           <w:szCs w:val="18"/>
         </w:rPr>
-        <w:t xml:space="preserve">cd /tmp/proitbridge-reviewai-demo
-git checkout -b demo-sql-injection
-mkdir -p src
-cat &gt; src/auth.py &lt;&lt;'PY'
-"""User authentication and lookup utilities."""
-import sqlite3
-db = sqlite3.connect("app.db")
-def get_user(user_id):
-    """Look up a user by ID — used by the support dashboard."""
-    query = f"SELECT * FROM users WHERE id={user_id}"
-    return db.execute(query).fetchone()
-PY
-git add src/auth.py
-git commit -m "Add user lookup endpoint for support team"
-git push -u origin demo-sql-injection
-gh pr create --fill</w:t>
+        <w:t xml:space="preserve">gh pr create --fill --title "Add user lookup by ID"</w:t>
+      </w:r>
+    </w:p>
+    <w:p>
+      <w:pPr>
+        <w:spacing w:after="80" w:before="80"/>
+      </w:pPr>
+      <w:r>
+        <w:rPr>
+          <w:i/>
+          <w:iCs/>
+        </w:rPr>
+        <w:t xml:space="preserve">Pushes a branch with src/auth.py containing:</w:t>
+      </w:r>
+    </w:p>
+    <w:p>
+      <w:pPr>
+        <w:shd w:fill="F8FAFC" w:val="clear"/>
+        <w:spacing w:after="60" w:before="60"/>
+      </w:pPr>
+      <w:r>
+        <w:rPr>
+          <w:rFonts w:ascii="Consolas" w:cs="Consolas" w:eastAsia="Consolas" w:hAnsi="Consolas"/>
+          <w:color w:val="0F172A"/>
+          <w:sz w:val="18"/>
+          <w:szCs w:val="18"/>
+        </w:rPr>
+        <w:t xml:space="preserve">query = f"SELECT * FROM users WHERE id={user_id}"   # SQL injection</w:t>
       </w:r>
     </w:p>
     <w:p>
@@ -5053,20 +7759,7 @@
         <w:pStyle w:val="Heading2"/>
       </w:pPr>
       <w:r>
-        <w:t xml:space="preserve">12.2 Step 2: Observe the Bot's Response (within 10 seconds)</w:t>
-      </w:r>
-    </w:p>
-    <w:p>
-      <w:pPr>
-        <w:spacing w:after="80" w:before="80"/>
-      </w:pPr>
-      <w:r>
-        <w:t xml:space="preserve">GitHub's webhook delivers to n8n. The pipeline executes through all 19 nodes. The bot posts three inline comments on the PR.</w:t>
-      </w:r>
-    </w:p>
-    <w:p>
-      <w:r>
-        <w:t xml:space="preserve"/>
+        <w:t xml:space="preserve">12.2 What the Bot Posts (within 8.2 s)</w:t>
       </w:r>
     </w:p>
     <w:tbl>
@@ -5082,11 +7775,10 @@
         </w:tblBorders>
       </w:tblPr>
       <w:tblGrid>
-        <w:gridCol w:w="1100"/>
         <w:gridCol w:w="800"/>
-        <w:gridCol w:w="1300"/>
-        <w:gridCol w:w="1300"/>
-        <w:gridCol w:w="4860"/>
+        <w:gridCol w:w="1500"/>
+        <w:gridCol w:w="1400"/>
+        <w:gridCol w:w="5660"/>
       </w:tblGrid>
       <w:tr>
         <w:trPr>
@@ -5118,7 +7810,7 @@
                 <w:sz w:val="20"/>
                 <w:szCs w:val="20"/>
               </w:rPr>
-              <w:t xml:space="preserve">Comment #</w:t>
+              <w:t xml:space="preserve">Line</w:t>
             </w:r>
           </w:p>
         </w:tc>
@@ -5148,7 +7840,7 @@
                 <w:sz w:val="20"/>
                 <w:szCs w:val="20"/>
               </w:rPr>
-              <w:t xml:space="preserve">Line</w:t>
+              <w:t xml:space="preserve">Severity</w:t>
             </w:r>
           </w:p>
         </w:tc>
@@ -5178,7 +7870,7 @@
                 <w:sz w:val="20"/>
                 <w:szCs w:val="20"/>
               </w:rPr>
-              <w:t xml:space="preserve">Severity</w:t>
+              <w:t xml:space="preserve">Category</w:t>
             </w:r>
           </w:p>
         </w:tc>
@@ -5208,94 +7900,34 @@
                 <w:sz w:val="20"/>
                 <w:szCs w:val="20"/>
               </w:rPr>
-              <w:t xml:space="preserve">Category</w:t>
-            </w:r>
-          </w:p>
-        </w:tc>
-        <w:tc>
-          <w:tcPr>
-            <w:tcW w:type="dxa" w:w="0"/>
-            <w:tcBorders>
-              <w:top w:val="single" w:color="CCCCCC" w:sz="4"/>
-              <w:left w:val="single" w:color="CCCCCC" w:sz="4"/>
-              <w:bottom w:val="single" w:color="CCCCCC" w:sz="4"/>
-              <w:right w:val="single" w:color="CCCCCC" w:sz="4"/>
-            </w:tcBorders>
-            <w:shd w:fill="0B1D3F" w:val="clear"/>
-            <w:tcMar>
-              <w:top w:type="dxa" w:w="100"/>
-              <w:left w:type="dxa" w:w="140"/>
-              <w:bottom w:type="dxa" w:w="100"/>
-              <w:right w:type="dxa" w:w="140"/>
-            </w:tcMar>
-          </w:tcPr>
-          <w:p>
-            <w:r>
-              <w:rPr>
+              <w:t xml:space="preserve">What the bot said</w:t>
+            </w:r>
+          </w:p>
+        </w:tc>
+      </w:tr>
+      <w:tr>
+        <w:tc>
+          <w:tcPr>
+            <w:tcW w:type="dxa" w:w="0"/>
+            <w:tcBorders>
+              <w:top w:val="single" w:color="CCCCCC" w:sz="4"/>
+              <w:left w:val="single" w:color="CCCCCC" w:sz="4"/>
+              <w:bottom w:val="single" w:color="CCCCCC" w:sz="4"/>
+              <w:right w:val="single" w:color="CCCCCC" w:sz="4"/>
+            </w:tcBorders>
+            <w:tcMar>
+              <w:top w:type="dxa" w:w="80"/>
+              <w:left w:type="dxa" w:w="140"/>
+              <w:bottom w:type="dxa" w:w="80"/>
+              <w:right w:type="dxa" w:w="140"/>
+            </w:tcMar>
+          </w:tcPr>
+          <w:p>
+            <w:r>
+              <w:rPr>
+                <w:rFonts w:ascii="Arial" w:cs="Arial" w:eastAsia="Arial" w:hAnsi="Arial"/>
                 <w:b/>
                 <w:bCs/>
-                <w:color w:val="FFFFFF"/>
-                <w:sz w:val="20"/>
-                <w:szCs w:val="20"/>
-              </w:rPr>
-              <w:t xml:space="preserve">Finding</w:t>
-            </w:r>
-          </w:p>
-        </w:tc>
-      </w:tr>
-      <w:tr>
-        <w:tc>
-          <w:tcPr>
-            <w:tcW w:type="dxa" w:w="0"/>
-            <w:tcBorders>
-              <w:top w:val="single" w:color="CCCCCC" w:sz="4"/>
-              <w:left w:val="single" w:color="CCCCCC" w:sz="4"/>
-              <w:bottom w:val="single" w:color="CCCCCC" w:sz="4"/>
-              <w:right w:val="single" w:color="CCCCCC" w:sz="4"/>
-            </w:tcBorders>
-            <w:tcMar>
-              <w:top w:type="dxa" w:w="80"/>
-              <w:left w:type="dxa" w:w="140"/>
-              <w:bottom w:type="dxa" w:w="80"/>
-              <w:right w:type="dxa" w:w="140"/>
-            </w:tcMar>
-          </w:tcPr>
-          <w:p>
-            <w:r>
-              <w:rPr>
-                <w:rFonts w:ascii="Arial" w:cs="Arial" w:eastAsia="Arial" w:hAnsi="Arial"/>
-                <w:b/>
-                <w:bCs/>
-                <w:color w:val="0F172A"/>
-                <w:sz w:val="20"/>
-                <w:szCs w:val="20"/>
-              </w:rPr>
-              <w:t xml:space="preserve">1</w:t>
-            </w:r>
-          </w:p>
-        </w:tc>
-        <w:tc>
-          <w:tcPr>
-            <w:tcW w:type="dxa" w:w="0"/>
-            <w:tcBorders>
-              <w:top w:val="single" w:color="CCCCCC" w:sz="4"/>
-              <w:left w:val="single" w:color="CCCCCC" w:sz="4"/>
-              <w:bottom w:val="single" w:color="CCCCCC" w:sz="4"/>
-              <w:right w:val="single" w:color="CCCCCC" w:sz="4"/>
-            </w:tcBorders>
-            <w:tcMar>
-              <w:top w:type="dxa" w:w="80"/>
-              <w:left w:type="dxa" w:w="140"/>
-              <w:bottom w:type="dxa" w:w="80"/>
-              <w:right w:type="dxa" w:w="140"/>
-            </w:tcMar>
-          </w:tcPr>
-          <w:p>
-            <w:r>
-              <w:rPr>
-                <w:rFonts w:ascii="Arial" w:cs="Arial" w:eastAsia="Arial" w:hAnsi="Arial"/>
-                <w:b w:val="false"/>
-                <w:bCs w:val="false"/>
                 <w:color w:val="0F172A"/>
                 <w:sz w:val="20"/>
                 <w:szCs w:val="20"/>
@@ -5390,7 +8022,7 @@
                 <w:sz w:val="20"/>
                 <w:szCs w:val="20"/>
               </w:rPr>
-              <w:t xml:space="preserve">SQL injection vulnerability: user_id is interpolated directly into the query string without parameterization</w:t>
+              <w:t xml:space="preserve">SQL injection — user_id interpolated directly into query</w:t>
             </w:r>
           </w:p>
         </w:tc>
@@ -5418,36 +8050,6 @@
                 <w:rFonts w:ascii="Arial" w:cs="Arial" w:eastAsia="Arial" w:hAnsi="Arial"/>
                 <w:b/>
                 <w:bCs/>
-                <w:color w:val="0F172A"/>
-                <w:sz w:val="20"/>
-                <w:szCs w:val="20"/>
-              </w:rPr>
-              <w:t xml:space="preserve">2</w:t>
-            </w:r>
-          </w:p>
-        </w:tc>
-        <w:tc>
-          <w:tcPr>
-            <w:tcW w:type="dxa" w:w="0"/>
-            <w:tcBorders>
-              <w:top w:val="single" w:color="CCCCCC" w:sz="4"/>
-              <w:left w:val="single" w:color="CCCCCC" w:sz="4"/>
-              <w:bottom w:val="single" w:color="CCCCCC" w:sz="4"/>
-              <w:right w:val="single" w:color="CCCCCC" w:sz="4"/>
-            </w:tcBorders>
-            <w:tcMar>
-              <w:top w:type="dxa" w:w="80"/>
-              <w:left w:type="dxa" w:w="140"/>
-              <w:bottom w:type="dxa" w:w="80"/>
-              <w:right w:type="dxa" w:w="140"/>
-            </w:tcMar>
-          </w:tcPr>
-          <w:p>
-            <w:r>
-              <w:rPr>
-                <w:rFonts w:ascii="Arial" w:cs="Arial" w:eastAsia="Arial" w:hAnsi="Arial"/>
-                <w:b w:val="false"/>
-                <w:bCs w:val="false"/>
                 <w:color w:val="0F172A"/>
                 <w:sz w:val="20"/>
                 <w:szCs w:val="20"/>
@@ -5542,7 +8144,7 @@
                 <w:sz w:val="20"/>
                 <w:szCs w:val="20"/>
               </w:rPr>
-              <w:t xml:space="preserve">No tests cover the new get_user code path; auth.py is a security boundary and needs coverage</w:t>
+              <w:t xml:space="preserve">No tests cover get_user — auth.py is a security boundary</w:t>
             </w:r>
           </w:p>
         </w:tc>
@@ -5570,36 +8172,6 @@
                 <w:rFonts w:ascii="Arial" w:cs="Arial" w:eastAsia="Arial" w:hAnsi="Arial"/>
                 <w:b/>
                 <w:bCs/>
-                <w:color w:val="0F172A"/>
-                <w:sz w:val="20"/>
-                <w:szCs w:val="20"/>
-              </w:rPr>
-              <w:t xml:space="preserve">3</w:t>
-            </w:r>
-          </w:p>
-        </w:tc>
-        <w:tc>
-          <w:tcPr>
-            <w:tcW w:type="dxa" w:w="0"/>
-            <w:tcBorders>
-              <w:top w:val="single" w:color="CCCCCC" w:sz="4"/>
-              <w:left w:val="single" w:color="CCCCCC" w:sz="4"/>
-              <w:bottom w:val="single" w:color="CCCCCC" w:sz="4"/>
-              <w:right w:val="single" w:color="CCCCCC" w:sz="4"/>
-            </w:tcBorders>
-            <w:tcMar>
-              <w:top w:type="dxa" w:w="80"/>
-              <w:left w:type="dxa" w:w="140"/>
-              <w:bottom w:type="dxa" w:w="80"/>
-              <w:right w:type="dxa" w:w="140"/>
-            </w:tcMar>
-          </w:tcPr>
-          <w:p>
-            <w:r>
-              <w:rPr>
-                <w:rFonts w:ascii="Arial" w:cs="Arial" w:eastAsia="Arial" w:hAnsi="Arial"/>
-                <w:b w:val="false"/>
-                <w:bCs w:val="false"/>
                 <w:color w:val="0F172A"/>
                 <w:sz w:val="20"/>
                 <w:szCs w:val="20"/>
@@ -5694,7 +8266,7 @@
                 <w:sz w:val="20"/>
                 <w:szCs w:val="20"/>
               </w:rPr>
-              <w:t xml:space="preserve">Module-level DB connection created without error handling or cleanup; unreachable DB at import time crashes the whole module</w:t>
+              <w:t xml:space="preserve">Module-level DB connection lacks error handling + cleanup</w:t>
             </w:r>
           </w:p>
         </w:tc>
@@ -5710,15 +8282,7 @@
         <w:pStyle w:val="Heading2"/>
       </w:pPr>
       <w:r>
-        <w:t xml:space="preserve">12.3 Step 3: Bot Posts a Summary Comment</w:t>
-      </w:r>
-    </w:p>
-    <w:p>
-      <w:pPr>
-        <w:spacing w:after="80" w:before="80"/>
-      </w:pPr>
-      <w:r>
-        <w:t xml:space="preserve">After the per-finding loop completes, the bot posts a single summary issue comment on the PR with a severity table.</w:t>
+        <w:t xml:space="preserve">12.3 Plus a Summary Comment</w:t>
       </w:r>
     </w:p>
     <w:p>
@@ -5733,18 +8297,14 @@
           <w:sz w:val="18"/>
           <w:szCs w:val="18"/>
         </w:rPr>
-        <w:t xml:space="preserve">## 🤖 ReviewAI · Review Summary
-**3 findings** across this PR
-| Severity | Count |
-| --- | ---: |
-| 🔴 Critical | 1 |
-| 🟠 High | 1 |
-| 🟡 Medium | 1 |
-| 🟢 Low | 0 |
-| ⚪ Nit | 0 |
-See inline comments above for details. Push a fix and I'll re-review
-automatically.
-— ProITBridge ReviewAI · Strive For Better Future</w:t>
+        <w:t xml:space="preserve">🤖 ReviewAI · Review Summary
+3 findings across this PR
+| Severity     | Count |
+| ------------ | ----: |
+| 🔴 Critical  |   1   |
+| 🟠 High      |   1   |
+| 🟡 Medium    |   1   |
+Push a fix — I'll re-review automatically.</w:t>
       </w:r>
     </w:p>
     <w:p>
@@ -5752,33 +8312,339 @@
         <w:pStyle w:val="Heading2"/>
       </w:pPr>
       <w:r>
-        <w:t xml:space="preserve">12.4 Step 4: Findings Land in Postgres</w:t>
-      </w:r>
-    </w:p>
-    <w:p>
-      <w:pPr>
-        <w:spacing w:after="80" w:before="80"/>
-      </w:pPr>
-      <w:r>
-        <w:t xml:space="preserve">All three findings are inserted into the findings table, linked to the prs row for this PR. The dashboard at /dashboard refreshes within 15 seconds and shows the new PR at the top of the queue.</w:t>
-      </w:r>
-    </w:p>
-    <w:p>
-      <w:pPr>
-        <w:pStyle w:val="Heading2"/>
-      </w:pPr>
-      <w:r>
-        <w:t xml:space="preserve">12.5 Step 5: Dashboard Reflects the New Data</w:t>
-      </w:r>
-    </w:p>
-    <w:p>
-      <w:pPr>
-        <w:spacing w:after="80" w:before="80"/>
-      </w:pPr>
-      <w:r>
-        <w:t xml:space="preserve">The Live PR Queue, Findings table, and Analytics page all update on the next auto-refresh (15-second interval) or on manual refresh. The 'Live data · Postgres' pill confirms the data is sourced from the real database, not from mock fixtures.</w:t>
-      </w:r>
-    </w:p>
+        <w:t xml:space="preserve">12.4 What Lands Where</w:t>
+      </w:r>
+    </w:p>
+    <w:tbl>
+      <w:tblPr>
+        <w:tblW w:type="dxa" w:w="9360"/>
+        <w:tblBorders>
+          <w:top w:val="single" w:color="auto" w:sz="4"/>
+          <w:left w:val="single" w:color="auto" w:sz="4"/>
+          <w:bottom w:val="single" w:color="auto" w:sz="4"/>
+          <w:right w:val="single" w:color="auto" w:sz="4"/>
+          <w:insideH w:val="single" w:color="auto" w:sz="4"/>
+          <w:insideV w:val="single" w:color="auto" w:sz="4"/>
+        </w:tblBorders>
+      </w:tblPr>
+      <w:tblGrid>
+        <w:gridCol w:w="2400"/>
+        <w:gridCol w:w="6960"/>
+      </w:tblGrid>
+      <w:tr>
+        <w:trPr>
+          <w:tblHeader/>
+        </w:trPr>
+        <w:tc>
+          <w:tcPr>
+            <w:tcW w:type="dxa" w:w="0"/>
+            <w:tcBorders>
+              <w:top w:val="single" w:color="CCCCCC" w:sz="4"/>
+              <w:left w:val="single" w:color="CCCCCC" w:sz="4"/>
+              <w:bottom w:val="single" w:color="CCCCCC" w:sz="4"/>
+              <w:right w:val="single" w:color="CCCCCC" w:sz="4"/>
+            </w:tcBorders>
+            <w:shd w:fill="0B1D3F" w:val="clear"/>
+            <w:tcMar>
+              <w:top w:type="dxa" w:w="100"/>
+              <w:left w:type="dxa" w:w="140"/>
+              <w:bottom w:type="dxa" w:w="100"/>
+              <w:right w:type="dxa" w:w="140"/>
+            </w:tcMar>
+          </w:tcPr>
+          <w:p>
+            <w:r>
+              <w:rPr>
+                <w:b/>
+                <w:bCs/>
+                <w:color w:val="FFFFFF"/>
+                <w:sz w:val="20"/>
+                <w:szCs w:val="20"/>
+              </w:rPr>
+              <w:t xml:space="preserve">Destination</w:t>
+            </w:r>
+          </w:p>
+        </w:tc>
+        <w:tc>
+          <w:tcPr>
+            <w:tcW w:type="dxa" w:w="0"/>
+            <w:tcBorders>
+              <w:top w:val="single" w:color="CCCCCC" w:sz="4"/>
+              <w:left w:val="single" w:color="CCCCCC" w:sz="4"/>
+              <w:bottom w:val="single" w:color="CCCCCC" w:sz="4"/>
+              <w:right w:val="single" w:color="CCCCCC" w:sz="4"/>
+            </w:tcBorders>
+            <w:shd w:fill="0B1D3F" w:val="clear"/>
+            <w:tcMar>
+              <w:top w:type="dxa" w:w="100"/>
+              <w:left w:type="dxa" w:w="140"/>
+              <w:bottom w:type="dxa" w:w="100"/>
+              <w:right w:type="dxa" w:w="140"/>
+            </w:tcMar>
+          </w:tcPr>
+          <w:p>
+            <w:r>
+              <w:rPr>
+                <w:b/>
+                <w:bCs/>
+                <w:color w:val="FFFFFF"/>
+                <w:sz w:val="20"/>
+                <w:szCs w:val="20"/>
+              </w:rPr>
+              <w:t xml:space="preserve">What gets written</w:t>
+            </w:r>
+          </w:p>
+        </w:tc>
+      </w:tr>
+      <w:tr>
+        <w:tc>
+          <w:tcPr>
+            <w:tcW w:type="dxa" w:w="0"/>
+            <w:tcBorders>
+              <w:top w:val="single" w:color="CCCCCC" w:sz="4"/>
+              <w:left w:val="single" w:color="CCCCCC" w:sz="4"/>
+              <w:bottom w:val="single" w:color="CCCCCC" w:sz="4"/>
+              <w:right w:val="single" w:color="CCCCCC" w:sz="4"/>
+            </w:tcBorders>
+            <w:tcMar>
+              <w:top w:type="dxa" w:w="80"/>
+              <w:left w:type="dxa" w:w="140"/>
+              <w:bottom w:type="dxa" w:w="80"/>
+              <w:right w:type="dxa" w:w="140"/>
+            </w:tcMar>
+          </w:tcPr>
+          <w:p>
+            <w:r>
+              <w:rPr>
+                <w:rFonts w:ascii="Arial" w:cs="Arial" w:eastAsia="Arial" w:hAnsi="Arial"/>
+                <w:b/>
+                <w:bCs/>
+                <w:color w:val="0F172A"/>
+                <w:sz w:val="20"/>
+                <w:szCs w:val="20"/>
+              </w:rPr>
+              <w:t xml:space="preserve">GitHub PR</w:t>
+            </w:r>
+          </w:p>
+        </w:tc>
+        <w:tc>
+          <w:tcPr>
+            <w:tcW w:type="dxa" w:w="0"/>
+            <w:tcBorders>
+              <w:top w:val="single" w:color="CCCCCC" w:sz="4"/>
+              <w:left w:val="single" w:color="CCCCCC" w:sz="4"/>
+              <w:bottom w:val="single" w:color="CCCCCC" w:sz="4"/>
+              <w:right w:val="single" w:color="CCCCCC" w:sz="4"/>
+            </w:tcBorders>
+            <w:tcMar>
+              <w:top w:type="dxa" w:w="80"/>
+              <w:left w:type="dxa" w:w="140"/>
+              <w:bottom w:type="dxa" w:w="80"/>
+              <w:right w:type="dxa" w:w="140"/>
+            </w:tcMar>
+          </w:tcPr>
+          <w:p>
+            <w:r>
+              <w:rPr>
+                <w:rFonts w:ascii="Arial" w:cs="Arial" w:eastAsia="Arial" w:hAnsi="Arial"/>
+                <w:b w:val="false"/>
+                <w:bCs w:val="false"/>
+                <w:color w:val="0F172A"/>
+                <w:sz w:val="20"/>
+                <w:szCs w:val="20"/>
+              </w:rPr>
+              <w:t xml:space="preserve">3 inline review comments (with suggestion blocks) + 1 summary issue comment</w:t>
+            </w:r>
+          </w:p>
+        </w:tc>
+      </w:tr>
+      <w:tr>
+        <w:tc>
+          <w:tcPr>
+            <w:tcW w:type="dxa" w:w="0"/>
+            <w:tcBorders>
+              <w:top w:val="single" w:color="CCCCCC" w:sz="4"/>
+              <w:left w:val="single" w:color="CCCCCC" w:sz="4"/>
+              <w:bottom w:val="single" w:color="CCCCCC" w:sz="4"/>
+              <w:right w:val="single" w:color="CCCCCC" w:sz="4"/>
+            </w:tcBorders>
+            <w:tcMar>
+              <w:top w:type="dxa" w:w="80"/>
+              <w:left w:type="dxa" w:w="140"/>
+              <w:bottom w:type="dxa" w:w="80"/>
+              <w:right w:type="dxa" w:w="140"/>
+            </w:tcMar>
+          </w:tcPr>
+          <w:p>
+            <w:r>
+              <w:rPr>
+                <w:rFonts w:ascii="Arial" w:cs="Arial" w:eastAsia="Arial" w:hAnsi="Arial"/>
+                <w:b/>
+                <w:bCs/>
+                <w:color w:val="0F172A"/>
+                <w:sz w:val="20"/>
+                <w:szCs w:val="20"/>
+              </w:rPr>
+              <w:t xml:space="preserve">Postgres prs table</w:t>
+            </w:r>
+          </w:p>
+        </w:tc>
+        <w:tc>
+          <w:tcPr>
+            <w:tcW w:type="dxa" w:w="0"/>
+            <w:tcBorders>
+              <w:top w:val="single" w:color="CCCCCC" w:sz="4"/>
+              <w:left w:val="single" w:color="CCCCCC" w:sz="4"/>
+              <w:bottom w:val="single" w:color="CCCCCC" w:sz="4"/>
+              <w:right w:val="single" w:color="CCCCCC" w:sz="4"/>
+            </w:tcBorders>
+            <w:tcMar>
+              <w:top w:type="dxa" w:w="80"/>
+              <w:left w:type="dxa" w:w="140"/>
+              <w:bottom w:type="dxa" w:w="80"/>
+              <w:right w:type="dxa" w:w="140"/>
+            </w:tcMar>
+          </w:tcPr>
+          <w:p>
+            <w:r>
+              <w:rPr>
+                <w:rFonts w:ascii="Arial" w:cs="Arial" w:eastAsia="Arial" w:hAnsi="Arial"/>
+                <w:b w:val="false"/>
+                <w:bCs w:val="false"/>
+                <w:color w:val="0F172A"/>
+                <w:sz w:val="20"/>
+                <w:szCs w:val="20"/>
+              </w:rPr>
+              <w:t xml:space="preserve">1 row with repo, pr_number, title, author, head_sha</w:t>
+            </w:r>
+          </w:p>
+        </w:tc>
+      </w:tr>
+      <w:tr>
+        <w:tc>
+          <w:tcPr>
+            <w:tcW w:type="dxa" w:w="0"/>
+            <w:tcBorders>
+              <w:top w:val="single" w:color="CCCCCC" w:sz="4"/>
+              <w:left w:val="single" w:color="CCCCCC" w:sz="4"/>
+              <w:bottom w:val="single" w:color="CCCCCC" w:sz="4"/>
+              <w:right w:val="single" w:color="CCCCCC" w:sz="4"/>
+            </w:tcBorders>
+            <w:tcMar>
+              <w:top w:type="dxa" w:w="80"/>
+              <w:left w:type="dxa" w:w="140"/>
+              <w:bottom w:type="dxa" w:w="80"/>
+              <w:right w:type="dxa" w:w="140"/>
+            </w:tcMar>
+          </w:tcPr>
+          <w:p>
+            <w:r>
+              <w:rPr>
+                <w:rFonts w:ascii="Arial" w:cs="Arial" w:eastAsia="Arial" w:hAnsi="Arial"/>
+                <w:b/>
+                <w:bCs/>
+                <w:color w:val="0F172A"/>
+                <w:sz w:val="20"/>
+                <w:szCs w:val="20"/>
+              </w:rPr>
+              <w:t xml:space="preserve">Postgres findings table</w:t>
+            </w:r>
+          </w:p>
+        </w:tc>
+        <w:tc>
+          <w:tcPr>
+            <w:tcW w:type="dxa" w:w="0"/>
+            <w:tcBorders>
+              <w:top w:val="single" w:color="CCCCCC" w:sz="4"/>
+              <w:left w:val="single" w:color="CCCCCC" w:sz="4"/>
+              <w:bottom w:val="single" w:color="CCCCCC" w:sz="4"/>
+              <w:right w:val="single" w:color="CCCCCC" w:sz="4"/>
+            </w:tcBorders>
+            <w:tcMar>
+              <w:top w:type="dxa" w:w="80"/>
+              <w:left w:type="dxa" w:w="140"/>
+              <w:bottom w:type="dxa" w:w="80"/>
+              <w:right w:type="dxa" w:w="140"/>
+            </w:tcMar>
+          </w:tcPr>
+          <w:p>
+            <w:r>
+              <w:rPr>
+                <w:rFonts w:ascii="Arial" w:cs="Arial" w:eastAsia="Arial" w:hAnsi="Arial"/>
+                <w:b w:val="false"/>
+                <w:bCs w:val="false"/>
+                <w:color w:val="0F172A"/>
+                <w:sz w:val="20"/>
+                <w:szCs w:val="20"/>
+              </w:rPr>
+              <w:t xml:space="preserve">3 rows linked to the prs row, one per finding, each with file_path + line_number + severity + category + suggestion + rationale + github_comment_id</w:t>
+            </w:r>
+          </w:p>
+        </w:tc>
+      </w:tr>
+      <w:tr>
+        <w:tc>
+          <w:tcPr>
+            <w:tcW w:type="dxa" w:w="0"/>
+            <w:tcBorders>
+              <w:top w:val="single" w:color="CCCCCC" w:sz="4"/>
+              <w:left w:val="single" w:color="CCCCCC" w:sz="4"/>
+              <w:bottom w:val="single" w:color="CCCCCC" w:sz="4"/>
+              <w:right w:val="single" w:color="CCCCCC" w:sz="4"/>
+            </w:tcBorders>
+            <w:tcMar>
+              <w:top w:type="dxa" w:w="80"/>
+              <w:left w:type="dxa" w:w="140"/>
+              <w:bottom w:type="dxa" w:w="80"/>
+              <w:right w:type="dxa" w:w="140"/>
+            </w:tcMar>
+          </w:tcPr>
+          <w:p>
+            <w:r>
+              <w:rPr>
+                <w:rFonts w:ascii="Arial" w:cs="Arial" w:eastAsia="Arial" w:hAnsi="Arial"/>
+                <w:b/>
+                <w:bCs/>
+                <w:color w:val="0F172A"/>
+                <w:sz w:val="20"/>
+                <w:szCs w:val="20"/>
+              </w:rPr>
+              <w:t xml:space="preserve">Dashboard</w:t>
+            </w:r>
+          </w:p>
+        </w:tc>
+        <w:tc>
+          <w:tcPr>
+            <w:tcW w:type="dxa" w:w="0"/>
+            <w:tcBorders>
+              <w:top w:val="single" w:color="CCCCCC" w:sz="4"/>
+              <w:left w:val="single" w:color="CCCCCC" w:sz="4"/>
+              <w:bottom w:val="single" w:color="CCCCCC" w:sz="4"/>
+              <w:right w:val="single" w:color="CCCCCC" w:sz="4"/>
+            </w:tcBorders>
+            <w:tcMar>
+              <w:top w:type="dxa" w:w="80"/>
+              <w:left w:type="dxa" w:w="140"/>
+              <w:bottom w:type="dxa" w:w="80"/>
+              <w:right w:type="dxa" w:w="140"/>
+            </w:tcMar>
+          </w:tcPr>
+          <w:p>
+            <w:r>
+              <w:rPr>
+                <w:rFonts w:ascii="Arial" w:cs="Arial" w:eastAsia="Arial" w:hAnsi="Arial"/>
+                <w:b w:val="false"/>
+                <w:bCs w:val="false"/>
+                <w:color w:val="0F172A"/>
+                <w:sz w:val="20"/>
+                <w:szCs w:val="20"/>
+              </w:rPr>
+              <w:t xml:space="preserve">PR appears at top of /dashboard within 15 s (auto-refresh) — Live data · Postgres pill confirms it's real data, not mock</w:t>
+            </w:r>
+          </w:p>
+        </w:tc>
+      </w:tr>
+    </w:tbl>
     <w:p>
       <w:pPr>
         <w:pStyle w:val="Heading1"/>

</xml_diff>